<commit_message>
Rewrite qualification SOP as linear prose
Remove tables and bullet lists in favor of flowing paragraphs. Replace
value prop bridges with the three objection-handle versions (volume,
quality, close rate) matching the cold call battle card.

https://claude.ai/code/session_01M8FUH5cHcZxm3eABXjpd9F
</commit_message>
<xml_diff>
--- a/reports/qualification_sop.docx
+++ b/reports/qualification_sop.docx
@@ -13,7 +13,7 @@
     </w:p>
     <w:p>
       <w:pPr>
-        <w:spacing w:after="280"/>
+        <w:spacing w:after="320"/>
       </w:pPr>
       <w:r>
         <w:rPr>
@@ -26,45 +26,24 @@
     </w:p>
     <w:p>
       <w:pPr>
-        <w:spacing w:after="200"/>
+        <w:spacing w:after="200" w:line="300" w:lineRule="auto"/>
       </w:pPr>
       <w:r>
         <w:rPr>
-          <w:b/>
+          <w:sz w:val="22"/>
         </w:rPr>
-        <w:t xml:space="preserve">The goal: </w:t>
-      </w:r>
-      <w:r>
-        <w:t xml:space="preserve">Get the prospect to say the pain out loud themselves, then pivot straight into </w:t>
-      </w:r>
-      <w:r>
-        <w:rPr>
-          <w:i/>
-        </w:rPr>
-        <w:t>"here's how we're fixing exactly that on our call."</w:t>
-      </w:r>
-      <w:r>
-        <w:t xml:space="preserve"> Qualification isn't small talk — it's setting up the pitch.</w:t>
+        <w:t>The goal is simple: get the prospect to say the pain out loud themselves, then pivot straight into "here's how we're fixing exactly that on our call." Qualification isn't small talk — it's how you set up the pitch. Every question you ask has a job, and your job is to listen closely enough that your next sentence is built on what they just said, not on what your script says next.</w:t>
       </w:r>
     </w:p>
     <w:p>
       <w:pPr>
-        <w:spacing w:after="280"/>
-        <w:ind w:left="288"/>
+        <w:spacing w:after="280" w:line="300" w:lineRule="auto"/>
       </w:pPr>
-      <w:r>
-        <w:rPr>
-          <w:b/>
-          <w:sz w:val="22"/>
-        </w:rPr>
-        <w:t xml:space="preserve">Watch this first: </w:t>
-      </w:r>
       <w:r>
         <w:rPr>
           <w:sz w:val="22"/>
         </w:rPr>
-        <w:t>Our Apr 3 training call walks through this exact framework. Rewatch it before calls until it feels second nature.</w:t>
-        <w:br/>
+        <w:t xml:space="preserve">Before every calling session, rewatch our Apr 3 training call until this framework feels second nature — it walks through exactly this flow with live examples. Link: </w:t>
       </w:r>
       <w:r>
         <w:rPr>
@@ -87,86 +66,24 @@
     </w:p>
     <w:p>
       <w:pPr>
-        <w:spacing w:after="200"/>
-        <w:jc w:val="center"/>
+        <w:spacing w:after="200" w:line="300" w:lineRule="auto"/>
       </w:pPr>
       <w:r>
         <w:rPr>
-          <w:b/>
-          <w:sz w:val="26"/>
+          <w:sz w:val="22"/>
         </w:rPr>
-        <w:t>ACKNOWLEDGE  →  BUILD  →  BRIDGE</w:t>
+        <w:t>After every qualifying question, you do three things in order: acknowledge, build, and bridge. Acknowledge means repeating what they said in one short sentence so they feel heard. Build means asking an implication question that expands their pain — it gets them to admit the weakness in what they're doing without you pointing it out. And bridge means pivoting straight into the value prop: "On our call I'll show you exactly how we're fixing that."</w:t>
       </w:r>
     </w:p>
     <w:p>
       <w:pPr>
-        <w:pStyle w:val="ListBullet"/>
-        <w:spacing w:after="60"/>
+        <w:spacing w:after="200" w:line="300" w:lineRule="auto"/>
       </w:pPr>
-      <w:r>
-        <w:rPr>
-          <w:b/>
-          <w:sz w:val="22"/>
-        </w:rPr>
-        <w:t xml:space="preserve">Acknowledge — </w:t>
-      </w:r>
       <w:r>
         <w:rPr>
           <w:sz w:val="22"/>
         </w:rPr>
-        <w:t>repeat what they said in one short sentence. Makes them feel heard.</w:t>
-      </w:r>
-    </w:p>
-    <w:p>
-      <w:pPr>
-        <w:pStyle w:val="ListBullet"/>
-        <w:spacing w:after="60"/>
-      </w:pPr>
-      <w:r>
-        <w:rPr>
-          <w:b/>
-          <w:sz w:val="22"/>
-        </w:rPr>
-        <w:t xml:space="preserve">Build — </w:t>
-      </w:r>
-      <w:r>
-        <w:rPr>
-          <w:sz w:val="22"/>
-        </w:rPr>
-        <w:t>ask an implication question that expands their pain. They admit the weakness themselves.</w:t>
-      </w:r>
-    </w:p>
-    <w:p>
-      <w:pPr>
-        <w:pStyle w:val="ListBullet"/>
-        <w:spacing w:after="60"/>
-      </w:pPr>
-      <w:r>
-        <w:rPr>
-          <w:b/>
-          <w:sz w:val="22"/>
-        </w:rPr>
-        <w:t xml:space="preserve">Bridge — </w:t>
-      </w:r>
-      <w:r>
-        <w:rPr>
-          <w:sz w:val="22"/>
-        </w:rPr>
-        <w:t>pivot into the value prop. "On our call I'll show you how we're fixing exactly that…"</w:t>
-      </w:r>
-    </w:p>
-    <w:p>
-      <w:pPr>
-        <w:spacing w:before="120" w:after="240"/>
-      </w:pPr>
-      <w:r>
-        <w:rPr>
-          <w:b/>
-        </w:rPr>
-        <w:t xml:space="preserve">Critical rule: </w:t>
-      </w:r>
-      <w:r>
-        <w:t>Build only after Q2. Q1 is just situational context — acknowledge and move on.</w:t>
+        <w:t>The critical rule is that you only build after Q2. Q1 is just situational context — you acknowledge it and move straight on. The implication question is the money moment, and it only works once they've named the pain themselves. If you probe on Q1, you'll come off salesy and eat your own ammo before they've opened up.</w:t>
       </w:r>
     </w:p>
     <w:p>
@@ -177,441 +94,29 @@
         <w:rPr>
           <w:color w:val="111111"/>
         </w:rPr>
-        <w:t>Q1 — What are you currently doing for lead generation?</w:t>
+        <w:t>Question 1 — What are you currently doing for lead generation?</w:t>
       </w:r>
     </w:p>
     <w:p>
       <w:pPr>
-        <w:spacing w:after="160"/>
+        <w:spacing w:after="200" w:line="300" w:lineRule="auto"/>
       </w:pPr>
       <w:r>
         <w:rPr>
-          <w:b w:val="0"/>
-          <w:i/>
-          <w:color w:val="666666"/>
           <w:sz w:val="22"/>
         </w:rPr>
-        <w:t>Acknowledge only. Don't probe. Move straight to Q2.</w:t>
+        <w:t>This question is purely situational. Don't probe, don't dig, don't follow up. Just reflect what they said in one short sentence and move straight to Q2. If they say referrals, you say "Got it, so mostly word of mouth." If they say Google Ads, you say "Okay, so paid search." If they tell you they've got an in-house SDR team, you say "Nice, so you've got a team running outbound." The pattern is the same for anything they tell you — one short reflection so they feel heard, then you move on.</w:t>
       </w:r>
     </w:p>
-    <w:tbl>
-      <w:tblPr>
-        <w:tblW w:type="auto" w:w="0"/>
-        <w:tblLayout w:type="fixed"/>
-        <w:tblLook w:firstColumn="1" w:firstRow="1" w:lastColumn="0" w:lastRow="0" w:noHBand="0" w:noVBand="1" w:val="04A0"/>
-      </w:tblPr>
-      <w:tblGrid>
-        <w:gridCol w:w="4824"/>
-        <w:gridCol w:w="4824"/>
-      </w:tblGrid>
-      <w:tr>
-        <w:tc>
-          <w:tcPr>
-            <w:tcW w:type="dxa" w:w="2304"/>
-            <w:vAlign w:val="top"/>
-            <w:tcBorders>
-              <w:top w:val="single" w:sz="4" w:space="0" w:color="DDDDDD"/>
-              <w:left w:val="single" w:sz="4" w:space="0" w:color="FFFFFF"/>
-              <w:bottom w:val="single" w:sz="4" w:space="0" w:color="DDDDDD"/>
-              <w:right w:val="single" w:sz="4" w:space="0" w:color="FFFFFF"/>
-            </w:tcBorders>
-          </w:tcPr>
-          <w:p>
-            <w:pPr>
-              <w:spacing w:after="40"/>
-            </w:pPr>
-            <w:r>
-              <w:rPr>
-                <w:b/>
-                <w:sz w:val="20"/>
-              </w:rPr>
-              <w:t>Referrals</w:t>
-            </w:r>
-          </w:p>
-        </w:tc>
-        <w:tc>
-          <w:tcPr>
-            <w:tcW w:type="dxa" w:w="6912"/>
-            <w:vAlign w:val="top"/>
-            <w:tcBorders>
-              <w:top w:val="single" w:sz="4" w:space="0" w:color="DDDDDD"/>
-              <w:left w:val="single" w:sz="4" w:space="0" w:color="FFFFFF"/>
-              <w:bottom w:val="single" w:sz="4" w:space="0" w:color="DDDDDD"/>
-              <w:right w:val="single" w:sz="4" w:space="0" w:color="FFFFFF"/>
-            </w:tcBorders>
-          </w:tcPr>
-          <w:p>
-            <w:pPr>
-              <w:spacing w:after="40"/>
-            </w:pPr>
-            <w:r>
-              <w:rPr>
-                <w:sz w:val="20"/>
-              </w:rPr>
-              <w:t>"Got it, so mostly word of mouth."</w:t>
-            </w:r>
-          </w:p>
-        </w:tc>
-      </w:tr>
-      <w:tr>
-        <w:tc>
-          <w:tcPr>
-            <w:tcW w:type="dxa" w:w="2304"/>
-            <w:vAlign w:val="top"/>
-            <w:tcBorders>
-              <w:top w:val="single" w:sz="4" w:space="0" w:color="DDDDDD"/>
-              <w:left w:val="single" w:sz="4" w:space="0" w:color="FFFFFF"/>
-              <w:bottom w:val="single" w:sz="4" w:space="0" w:color="DDDDDD"/>
-              <w:right w:val="single" w:sz="4" w:space="0" w:color="FFFFFF"/>
-            </w:tcBorders>
-          </w:tcPr>
-          <w:p>
-            <w:pPr>
-              <w:spacing w:after="40"/>
-            </w:pPr>
-            <w:r>
-              <w:rPr>
-                <w:b/>
-                <w:sz w:val="20"/>
-              </w:rPr>
-              <w:t>Google Ads / paid</w:t>
-            </w:r>
-          </w:p>
-        </w:tc>
-        <w:tc>
-          <w:tcPr>
-            <w:tcW w:type="dxa" w:w="6912"/>
-            <w:vAlign w:val="top"/>
-            <w:tcBorders>
-              <w:top w:val="single" w:sz="4" w:space="0" w:color="DDDDDD"/>
-              <w:left w:val="single" w:sz="4" w:space="0" w:color="FFFFFF"/>
-              <w:bottom w:val="single" w:sz="4" w:space="0" w:color="DDDDDD"/>
-              <w:right w:val="single" w:sz="4" w:space="0" w:color="FFFFFF"/>
-            </w:tcBorders>
-          </w:tcPr>
-          <w:p>
-            <w:pPr>
-              <w:spacing w:after="40"/>
-            </w:pPr>
-            <w:r>
-              <w:rPr>
-                <w:sz w:val="20"/>
-              </w:rPr>
-              <w:t>"Okay, so paid search."</w:t>
-            </w:r>
-          </w:p>
-        </w:tc>
-      </w:tr>
-      <w:tr>
-        <w:tc>
-          <w:tcPr>
-            <w:tcW w:type="dxa" w:w="2304"/>
-            <w:vAlign w:val="top"/>
-            <w:tcBorders>
-              <w:top w:val="single" w:sz="4" w:space="0" w:color="DDDDDD"/>
-              <w:left w:val="single" w:sz="4" w:space="0" w:color="FFFFFF"/>
-              <w:bottom w:val="single" w:sz="4" w:space="0" w:color="DDDDDD"/>
-              <w:right w:val="single" w:sz="4" w:space="0" w:color="FFFFFF"/>
-            </w:tcBorders>
-          </w:tcPr>
-          <w:p>
-            <w:pPr>
-              <w:spacing w:after="40"/>
-            </w:pPr>
-            <w:r>
-              <w:rPr>
-                <w:b/>
-                <w:sz w:val="20"/>
-              </w:rPr>
-              <w:t>In-house SDRs</w:t>
-            </w:r>
-          </w:p>
-        </w:tc>
-        <w:tc>
-          <w:tcPr>
-            <w:tcW w:type="dxa" w:w="6912"/>
-            <w:vAlign w:val="top"/>
-            <w:tcBorders>
-              <w:top w:val="single" w:sz="4" w:space="0" w:color="DDDDDD"/>
-              <w:left w:val="single" w:sz="4" w:space="0" w:color="FFFFFF"/>
-              <w:bottom w:val="single" w:sz="4" w:space="0" w:color="DDDDDD"/>
-              <w:right w:val="single" w:sz="4" w:space="0" w:color="FFFFFF"/>
-            </w:tcBorders>
-          </w:tcPr>
-          <w:p>
-            <w:pPr>
-              <w:spacing w:after="40"/>
-            </w:pPr>
-            <w:r>
-              <w:rPr>
-                <w:sz w:val="20"/>
-              </w:rPr>
-              <w:t>"Nice, so you've got a team running outbound."</w:t>
-            </w:r>
-          </w:p>
-        </w:tc>
-      </w:tr>
-      <w:tr>
-        <w:tc>
-          <w:tcPr>
-            <w:tcW w:type="dxa" w:w="2304"/>
-            <w:vAlign w:val="top"/>
-            <w:tcBorders>
-              <w:top w:val="single" w:sz="4" w:space="0" w:color="DDDDDD"/>
-              <w:left w:val="single" w:sz="4" w:space="0" w:color="FFFFFF"/>
-              <w:bottom w:val="single" w:sz="4" w:space="0" w:color="DDDDDD"/>
-              <w:right w:val="single" w:sz="4" w:space="0" w:color="FFFFFF"/>
-            </w:tcBorders>
-          </w:tcPr>
-          <w:p>
-            <w:pPr>
-              <w:spacing w:after="40"/>
-            </w:pPr>
-            <w:r>
-              <w:rPr>
-                <w:b/>
-                <w:sz w:val="20"/>
-              </w:rPr>
-              <w:t>Trade shows</w:t>
-            </w:r>
-          </w:p>
-        </w:tc>
-        <w:tc>
-          <w:tcPr>
-            <w:tcW w:type="dxa" w:w="6912"/>
-            <w:vAlign w:val="top"/>
-            <w:tcBorders>
-              <w:top w:val="single" w:sz="4" w:space="0" w:color="DDDDDD"/>
-              <w:left w:val="single" w:sz="4" w:space="0" w:color="FFFFFF"/>
-              <w:bottom w:val="single" w:sz="4" w:space="0" w:color="DDDDDD"/>
-              <w:right w:val="single" w:sz="4" w:space="0" w:color="FFFFFF"/>
-            </w:tcBorders>
-          </w:tcPr>
-          <w:p>
-            <w:pPr>
-              <w:spacing w:after="40"/>
-            </w:pPr>
-            <w:r>
-              <w:rPr>
-                <w:sz w:val="20"/>
-              </w:rPr>
-              <w:t>"Got it, so events are driving it."</w:t>
-            </w:r>
-          </w:p>
-        </w:tc>
-      </w:tr>
-      <w:tr>
-        <w:tc>
-          <w:tcPr>
-            <w:tcW w:type="dxa" w:w="2304"/>
-            <w:vAlign w:val="top"/>
-            <w:tcBorders>
-              <w:top w:val="single" w:sz="4" w:space="0" w:color="DDDDDD"/>
-              <w:left w:val="single" w:sz="4" w:space="0" w:color="FFFFFF"/>
-              <w:bottom w:val="single" w:sz="4" w:space="0" w:color="DDDDDD"/>
-              <w:right w:val="single" w:sz="4" w:space="0" w:color="FFFFFF"/>
-            </w:tcBorders>
-          </w:tcPr>
-          <w:p>
-            <w:pPr>
-              <w:spacing w:after="40"/>
-            </w:pPr>
-            <w:r>
-              <w:rPr>
-                <w:b/>
-                <w:sz w:val="20"/>
-              </w:rPr>
-              <w:t>LinkedIn / social</w:t>
-            </w:r>
-          </w:p>
-        </w:tc>
-        <w:tc>
-          <w:tcPr>
-            <w:tcW w:type="dxa" w:w="6912"/>
-            <w:vAlign w:val="top"/>
-            <w:tcBorders>
-              <w:top w:val="single" w:sz="4" w:space="0" w:color="DDDDDD"/>
-              <w:left w:val="single" w:sz="4" w:space="0" w:color="FFFFFF"/>
-              <w:bottom w:val="single" w:sz="4" w:space="0" w:color="DDDDDD"/>
-              <w:right w:val="single" w:sz="4" w:space="0" w:color="FFFFFF"/>
-            </w:tcBorders>
-          </w:tcPr>
-          <w:p>
-            <w:pPr>
-              <w:spacing w:after="40"/>
-            </w:pPr>
-            <w:r>
-              <w:rPr>
-                <w:sz w:val="20"/>
-              </w:rPr>
-              <w:t>"Okay, LinkedIn is the main channel."</w:t>
-            </w:r>
-          </w:p>
-        </w:tc>
-      </w:tr>
-      <w:tr>
-        <w:tc>
-          <w:tcPr>
-            <w:tcW w:type="dxa" w:w="2304"/>
-            <w:vAlign w:val="top"/>
-            <w:tcBorders>
-              <w:top w:val="single" w:sz="4" w:space="0" w:color="DDDDDD"/>
-              <w:left w:val="single" w:sz="4" w:space="0" w:color="FFFFFF"/>
-              <w:bottom w:val="single" w:sz="4" w:space="0" w:color="DDDDDD"/>
-              <w:right w:val="single" w:sz="4" w:space="0" w:color="FFFFFF"/>
-            </w:tcBorders>
-          </w:tcPr>
-          <w:p>
-            <w:pPr>
-              <w:spacing w:after="40"/>
-            </w:pPr>
-            <w:r>
-              <w:rPr>
-                <w:b/>
-                <w:sz w:val="20"/>
-              </w:rPr>
-              <w:t>Email marketing</w:t>
-            </w:r>
-          </w:p>
-        </w:tc>
-        <w:tc>
-          <w:tcPr>
-            <w:tcW w:type="dxa" w:w="6912"/>
-            <w:vAlign w:val="top"/>
-            <w:tcBorders>
-              <w:top w:val="single" w:sz="4" w:space="0" w:color="DDDDDD"/>
-              <w:left w:val="single" w:sz="4" w:space="0" w:color="FFFFFF"/>
-              <w:bottom w:val="single" w:sz="4" w:space="0" w:color="DDDDDD"/>
-              <w:right w:val="single" w:sz="4" w:space="0" w:color="FFFFFF"/>
-            </w:tcBorders>
-          </w:tcPr>
-          <w:p>
-            <w:pPr>
-              <w:spacing w:after="40"/>
-            </w:pPr>
-            <w:r>
-              <w:rPr>
-                <w:sz w:val="20"/>
-              </w:rPr>
-              <w:t>"Got it, so email is carrying it."</w:t>
-            </w:r>
-          </w:p>
-        </w:tc>
-      </w:tr>
-      <w:tr>
-        <w:tc>
-          <w:tcPr>
-            <w:tcW w:type="dxa" w:w="2304"/>
-            <w:vAlign w:val="top"/>
-            <w:tcBorders>
-              <w:top w:val="single" w:sz="4" w:space="0" w:color="DDDDDD"/>
-              <w:left w:val="single" w:sz="4" w:space="0" w:color="FFFFFF"/>
-              <w:bottom w:val="single" w:sz="4" w:space="0" w:color="DDDDDD"/>
-              <w:right w:val="single" w:sz="4" w:space="0" w:color="FFFFFF"/>
-            </w:tcBorders>
-          </w:tcPr>
-          <w:p>
-            <w:pPr>
-              <w:spacing w:after="40"/>
-            </w:pPr>
-            <w:r>
-              <w:rPr>
-                <w:b/>
-                <w:sz w:val="20"/>
-              </w:rPr>
-              <w:t>Inbound only</w:t>
-            </w:r>
-          </w:p>
-        </w:tc>
-        <w:tc>
-          <w:tcPr>
-            <w:tcW w:type="dxa" w:w="6912"/>
-            <w:vAlign w:val="top"/>
-            <w:tcBorders>
-              <w:top w:val="single" w:sz="4" w:space="0" w:color="DDDDDD"/>
-              <w:left w:val="single" w:sz="4" w:space="0" w:color="FFFFFF"/>
-              <w:bottom w:val="single" w:sz="4" w:space="0" w:color="DDDDDD"/>
-              <w:right w:val="single" w:sz="4" w:space="0" w:color="FFFFFF"/>
-            </w:tcBorders>
-          </w:tcPr>
-          <w:p>
-            <w:pPr>
-              <w:spacing w:after="40"/>
-            </w:pPr>
-            <w:r>
-              <w:rPr>
-                <w:sz w:val="20"/>
-              </w:rPr>
-              <w:t>"Got it, so inbound is doing the work."</w:t>
-            </w:r>
-          </w:p>
-        </w:tc>
-      </w:tr>
-      <w:tr>
-        <w:tc>
-          <w:tcPr>
-            <w:tcW w:type="dxa" w:w="2304"/>
-            <w:vAlign w:val="top"/>
-            <w:tcBorders>
-              <w:top w:val="single" w:sz="4" w:space="0" w:color="DDDDDD"/>
-              <w:left w:val="single" w:sz="4" w:space="0" w:color="FFFFFF"/>
-              <w:bottom w:val="single" w:sz="4" w:space="0" w:color="DDDDDD"/>
-              <w:right w:val="single" w:sz="4" w:space="0" w:color="FFFFFF"/>
-            </w:tcBorders>
-          </w:tcPr>
-          <w:p>
-            <w:pPr>
-              <w:spacing w:after="40"/>
-            </w:pPr>
-            <w:r>
-              <w:rPr>
-                <w:b/>
-                <w:sz w:val="20"/>
-              </w:rPr>
-              <w:t>Agency / vendor</w:t>
-            </w:r>
-          </w:p>
-        </w:tc>
-        <w:tc>
-          <w:tcPr>
-            <w:tcW w:type="dxa" w:w="6912"/>
-            <w:vAlign w:val="top"/>
-            <w:tcBorders>
-              <w:top w:val="single" w:sz="4" w:space="0" w:color="DDDDDD"/>
-              <w:left w:val="single" w:sz="4" w:space="0" w:color="FFFFFF"/>
-              <w:bottom w:val="single" w:sz="4" w:space="0" w:color="DDDDDD"/>
-              <w:right w:val="single" w:sz="4" w:space="0" w:color="FFFFFF"/>
-            </w:tcBorders>
-          </w:tcPr>
-          <w:p>
-            <w:pPr>
-              <w:spacing w:after="40"/>
-            </w:pPr>
-            <w:r>
-              <w:rPr>
-                <w:sz w:val="20"/>
-              </w:rPr>
-              <w:t>"Okay, so you've outsourced it."</w:t>
-            </w:r>
-          </w:p>
-        </w:tc>
-      </w:tr>
-    </w:tbl>
     <w:p>
       <w:pPr>
-        <w:spacing w:before="160" w:after="240"/>
+        <w:spacing w:after="200" w:line="300" w:lineRule="auto"/>
       </w:pPr>
       <w:r>
         <w:rPr>
-          <w:b/>
+          <w:sz w:val="22"/>
         </w:rPr>
-        <w:t xml:space="preserve">If they go silent: </w:t>
-      </w:r>
-      <w:r>
-        <w:rPr>
-          <w:i/>
-        </w:rPr>
-        <w:t>"Got it — anything else, or is that the main channel?"</w:t>
+        <w:t>If they give you a one-word answer and go silent on you, the fallback is neutral — not a probe. Something like "Got it — anything else, or is that the main channel?" That keeps them talking without making it feel like an interrogation.</w:t>
       </w:r>
     </w:p>
     <w:p>
@@ -622,328 +127,42 @@
         <w:rPr>
           <w:color w:val="111111"/>
         </w:rPr>
-        <w:t>Q2 — What would you want to improve about it?</w:t>
+        <w:t>Question 2 — What would you want to improve about it?</w:t>
       </w:r>
     </w:p>
     <w:p>
       <w:pPr>
-        <w:spacing w:after="160"/>
+        <w:spacing w:after="200" w:line="300" w:lineRule="auto"/>
       </w:pPr>
       <w:r>
         <w:rPr>
-          <w:b w:val="0"/>
-          <w:i/>
-          <w:color w:val="666666"/>
           <w:sz w:val="22"/>
         </w:rPr>
-        <w:t>This is the money question. Acknowledge + hit them with the implication.</w:t>
+        <w:t>This is the money question. Whatever they say, your job is to reflect it back and immediately follow with one question that makes the pain bigger in their own head. You're not telling them anything — you're asking a question they have to answer, and the answer is what turns a complaint into a real pain point.</w:t>
       </w:r>
     </w:p>
-    <w:tbl>
-      <w:tblPr>
-        <w:tblW w:type="auto" w:w="0"/>
-        <w:tblLayout w:type="fixed"/>
-        <w:tblLook w:firstColumn="1" w:firstRow="1" w:lastColumn="0" w:lastRow="0" w:noHBand="0" w:noVBand="1" w:val="04A0"/>
-      </w:tblPr>
-      <w:tblGrid>
-        <w:gridCol w:w="4824"/>
-        <w:gridCol w:w="4824"/>
-      </w:tblGrid>
-      <w:tr>
-        <w:tc>
-          <w:tcPr>
-            <w:tcW w:type="dxa" w:w="2304"/>
-            <w:vAlign w:val="top"/>
-            <w:tcBorders>
-              <w:top w:val="single" w:sz="4" w:space="0" w:color="DDDDDD"/>
-              <w:left w:val="single" w:sz="4" w:space="0" w:color="FFFFFF"/>
-              <w:bottom w:val="single" w:sz="4" w:space="0" w:color="DDDDDD"/>
-              <w:right w:val="single" w:sz="4" w:space="0" w:color="FFFFFF"/>
-            </w:tcBorders>
-          </w:tcPr>
-          <w:p>
-            <w:pPr>
-              <w:spacing w:after="40"/>
-            </w:pPr>
-            <w:r>
-              <w:rPr>
-                <w:b/>
-                <w:sz w:val="20"/>
-              </w:rPr>
-              <w:t>Not enough volume</w:t>
-            </w:r>
-          </w:p>
-        </w:tc>
-        <w:tc>
-          <w:tcPr>
-            <w:tcW w:type="dxa" w:w="6912"/>
-            <w:vAlign w:val="top"/>
-            <w:tcBorders>
-              <w:top w:val="single" w:sz="4" w:space="0" w:color="DDDDDD"/>
-              <w:left w:val="single" w:sz="4" w:space="0" w:color="FFFFFF"/>
-              <w:bottom w:val="single" w:sz="4" w:space="0" w:color="DDDDDD"/>
-              <w:right w:val="single" w:sz="4" w:space="0" w:color="FFFFFF"/>
-            </w:tcBorders>
-          </w:tcPr>
-          <w:p>
-            <w:pPr>
-              <w:spacing w:after="40"/>
-            </w:pPr>
-            <w:r>
-              <w:rPr>
-                <w:sz w:val="20"/>
-              </w:rPr>
-              <w:t>"Yeah, so is what you're doing giving you the growth you're looking for?"</w:t>
-            </w:r>
-          </w:p>
-        </w:tc>
-      </w:tr>
-      <w:tr>
-        <w:tc>
-          <w:tcPr>
-            <w:tcW w:type="dxa" w:w="2304"/>
-            <w:vAlign w:val="top"/>
-            <w:tcBorders>
-              <w:top w:val="single" w:sz="4" w:space="0" w:color="DDDDDD"/>
-              <w:left w:val="single" w:sz="4" w:space="0" w:color="FFFFFF"/>
-              <w:bottom w:val="single" w:sz="4" w:space="0" w:color="DDDDDD"/>
-              <w:right w:val="single" w:sz="4" w:space="0" w:color="FFFFFF"/>
-            </w:tcBorders>
-          </w:tcPr>
-          <w:p>
-            <w:pPr>
-              <w:spacing w:after="40"/>
-            </w:pPr>
-            <w:r>
-              <w:rPr>
-                <w:b/>
-                <w:sz w:val="20"/>
-              </w:rPr>
-              <w:t>Bad lead quality</w:t>
-            </w:r>
-          </w:p>
-        </w:tc>
-        <w:tc>
-          <w:tcPr>
-            <w:tcW w:type="dxa" w:w="6912"/>
-            <w:vAlign w:val="top"/>
-            <w:tcBorders>
-              <w:top w:val="single" w:sz="4" w:space="0" w:color="DDDDDD"/>
-              <w:left w:val="single" w:sz="4" w:space="0" w:color="FFFFFF"/>
-              <w:bottom w:val="single" w:sz="4" w:space="0" w:color="DDDDDD"/>
-              <w:right w:val="single" w:sz="4" w:space="0" w:color="FFFFFF"/>
-            </w:tcBorders>
-          </w:tcPr>
-          <w:p>
-            <w:pPr>
-              <w:spacing w:after="40"/>
-            </w:pPr>
-            <w:r>
-              <w:rPr>
-                <w:sz w:val="20"/>
-              </w:rPr>
-              <w:t>"Got it. So you're often talking to the wrong people or small accounts?"</w:t>
-            </w:r>
-          </w:p>
-        </w:tc>
-      </w:tr>
-      <w:tr>
-        <w:tc>
-          <w:tcPr>
-            <w:tcW w:type="dxa" w:w="2304"/>
-            <w:vAlign w:val="top"/>
-            <w:tcBorders>
-              <w:top w:val="single" w:sz="4" w:space="0" w:color="DDDDDD"/>
-              <w:left w:val="single" w:sz="4" w:space="0" w:color="FFFFFF"/>
-              <w:bottom w:val="single" w:sz="4" w:space="0" w:color="DDDDDD"/>
-              <w:right w:val="single" w:sz="4" w:space="0" w:color="FFFFFF"/>
-            </w:tcBorders>
-          </w:tcPr>
-          <w:p>
-            <w:pPr>
-              <w:spacing w:after="40"/>
-            </w:pPr>
-            <w:r>
-              <w:rPr>
-                <w:b/>
-                <w:sz w:val="20"/>
-              </w:rPr>
-              <w:t>Inconsistent</w:t>
-            </w:r>
-          </w:p>
-        </w:tc>
-        <w:tc>
-          <w:tcPr>
-            <w:tcW w:type="dxa" w:w="6912"/>
-            <w:vAlign w:val="top"/>
-            <w:tcBorders>
-              <w:top w:val="single" w:sz="4" w:space="0" w:color="DDDDDD"/>
-              <w:left w:val="single" w:sz="4" w:space="0" w:color="FFFFFF"/>
-              <w:bottom w:val="single" w:sz="4" w:space="0" w:color="DDDDDD"/>
-              <w:right w:val="single" w:sz="4" w:space="0" w:color="FFFFFF"/>
-            </w:tcBorders>
-          </w:tcPr>
-          <w:p>
-            <w:pPr>
-              <w:spacing w:after="40"/>
-            </w:pPr>
-            <w:r>
-              <w:rPr>
-                <w:sz w:val="20"/>
-              </w:rPr>
-              <w:t>"Makes sense. So you can't really forecast pipeline month to month?"</w:t>
-            </w:r>
-          </w:p>
-        </w:tc>
-      </w:tr>
-      <w:tr>
-        <w:tc>
-          <w:tcPr>
-            <w:tcW w:type="dxa" w:w="2304"/>
-            <w:vAlign w:val="top"/>
-            <w:tcBorders>
-              <w:top w:val="single" w:sz="4" w:space="0" w:color="DDDDDD"/>
-              <w:left w:val="single" w:sz="4" w:space="0" w:color="FFFFFF"/>
-              <w:bottom w:val="single" w:sz="4" w:space="0" w:color="DDDDDD"/>
-              <w:right w:val="single" w:sz="4" w:space="0" w:color="FFFFFF"/>
-            </w:tcBorders>
-          </w:tcPr>
-          <w:p>
-            <w:pPr>
-              <w:spacing w:after="40"/>
-            </w:pPr>
-            <w:r>
-              <w:rPr>
-                <w:b/>
-                <w:sz w:val="20"/>
-              </w:rPr>
-              <w:t>Too expensive / bad ROI</w:t>
-            </w:r>
-          </w:p>
-        </w:tc>
-        <w:tc>
-          <w:tcPr>
-            <w:tcW w:type="dxa" w:w="6912"/>
-            <w:vAlign w:val="top"/>
-            <w:tcBorders>
-              <w:top w:val="single" w:sz="4" w:space="0" w:color="DDDDDD"/>
-              <w:left w:val="single" w:sz="4" w:space="0" w:color="FFFFFF"/>
-              <w:bottom w:val="single" w:sz="4" w:space="0" w:color="DDDDDD"/>
-              <w:right w:val="single" w:sz="4" w:space="0" w:color="FFFFFF"/>
-            </w:tcBorders>
-          </w:tcPr>
-          <w:p>
-            <w:pPr>
-              <w:spacing w:after="40"/>
-            </w:pPr>
-            <w:r>
-              <w:rPr>
-                <w:sz w:val="20"/>
-              </w:rPr>
-              <w:t>"Got it. And is that sustainable at the scale you want to hit?"</w:t>
-            </w:r>
-          </w:p>
-        </w:tc>
-      </w:tr>
-      <w:tr>
-        <w:tc>
-          <w:tcPr>
-            <w:tcW w:type="dxa" w:w="2304"/>
-            <w:vAlign w:val="top"/>
-            <w:tcBorders>
-              <w:top w:val="single" w:sz="4" w:space="0" w:color="DDDDDD"/>
-              <w:left w:val="single" w:sz="4" w:space="0" w:color="FFFFFF"/>
-              <w:bottom w:val="single" w:sz="4" w:space="0" w:color="DDDDDD"/>
-              <w:right w:val="single" w:sz="4" w:space="0" w:color="FFFFFF"/>
-            </w:tcBorders>
-          </w:tcPr>
-          <w:p>
-            <w:pPr>
-              <w:spacing w:after="40"/>
-            </w:pPr>
-            <w:r>
-              <w:rPr>
-                <w:b/>
-                <w:sz w:val="20"/>
-              </w:rPr>
-              <w:t>Hard to scale</w:t>
-            </w:r>
-          </w:p>
-        </w:tc>
-        <w:tc>
-          <w:tcPr>
-            <w:tcW w:type="dxa" w:w="6912"/>
-            <w:vAlign w:val="top"/>
-            <w:tcBorders>
-              <w:top w:val="single" w:sz="4" w:space="0" w:color="DDDDDD"/>
-              <w:left w:val="single" w:sz="4" w:space="0" w:color="FFFFFF"/>
-              <w:bottom w:val="single" w:sz="4" w:space="0" w:color="DDDDDD"/>
-              <w:right w:val="single" w:sz="4" w:space="0" w:color="FFFFFF"/>
-            </w:tcBorders>
-          </w:tcPr>
-          <w:p>
-            <w:pPr>
-              <w:spacing w:after="40"/>
-            </w:pPr>
-            <w:r>
-              <w:rPr>
-                <w:sz w:val="20"/>
-              </w:rPr>
-              <w:t>"So right now growth is capped by how much your team can personally handle?"</w:t>
-            </w:r>
-          </w:p>
-        </w:tc>
-      </w:tr>
-      <w:tr>
-        <w:tc>
-          <w:tcPr>
-            <w:tcW w:type="dxa" w:w="2304"/>
-            <w:vAlign w:val="top"/>
-            <w:tcBorders>
-              <w:top w:val="single" w:sz="4" w:space="0" w:color="DDDDDD"/>
-              <w:left w:val="single" w:sz="4" w:space="0" w:color="FFFFFF"/>
-              <w:bottom w:val="single" w:sz="4" w:space="0" w:color="DDDDDD"/>
-              <w:right w:val="single" w:sz="4" w:space="0" w:color="FFFFFF"/>
-            </w:tcBorders>
-          </w:tcPr>
-          <w:p>
-            <w:pPr>
-              <w:spacing w:after="40"/>
-            </w:pPr>
-            <w:r>
-              <w:rPr>
-                <w:b/>
-                <w:sz w:val="20"/>
-              </w:rPr>
-              <w:t>Can't measure it</w:t>
-            </w:r>
-          </w:p>
-        </w:tc>
-        <w:tc>
-          <w:tcPr>
-            <w:tcW w:type="dxa" w:w="6912"/>
-            <w:vAlign w:val="top"/>
-            <w:tcBorders>
-              <w:top w:val="single" w:sz="4" w:space="0" w:color="DDDDDD"/>
-              <w:left w:val="single" w:sz="4" w:space="0" w:color="FFFFFF"/>
-              <w:bottom w:val="single" w:sz="4" w:space="0" w:color="DDDDDD"/>
-              <w:right w:val="single" w:sz="4" w:space="0" w:color="FFFFFF"/>
-            </w:tcBorders>
-          </w:tcPr>
-          <w:p>
-            <w:pPr>
-              <w:spacing w:after="40"/>
-            </w:pPr>
-            <w:r>
-              <w:rPr>
-                <w:sz w:val="20"/>
-              </w:rPr>
-              <w:t>"Yeah, so you're flying a bit blind on what's actually driving revenue?"</w:t>
-            </w:r>
-          </w:p>
-        </w:tc>
-      </w:tr>
-    </w:tbl>
+    <w:p>
+      <w:pPr>
+        <w:spacing w:after="200" w:line="300" w:lineRule="auto"/>
+      </w:pPr>
+      <w:r>
+        <w:rPr>
+          <w:sz w:val="22"/>
+        </w:rPr>
+        <w:t>If they say they need more volume, you come back with: "Yeah — and is what you're doing now actually giving you the growth you're looking for?" If they say the lead quality is bad, you say: "Got it — so a lot of the time you're talking to the wrong people or small accounts?" If they say their close rate is low, you say: "So the meetings are happening, but they're just not turning into deals?" If they say it's inconsistent, you say: "Makes sense — so you can't really forecast pipeline month to month?"</w:t>
+      </w:r>
+    </w:p>
+    <w:p>
+      <w:pPr>
+        <w:spacing w:after="200" w:line="300" w:lineRule="auto"/>
+      </w:pPr>
+      <w:r>
+        <w:rPr>
+          <w:sz w:val="22"/>
+        </w:rPr>
+        <w:t>The point isn't to memorize a response for every possible answer. The point is to always reflect first, then ask one question that makes them feel the pain a little deeper. Once they've admitted it a second time, you move straight into the bridge.</w:t>
+      </w:r>
+    </w:p>
     <w:p>
       <w:pPr>
         <w:pStyle w:val="Heading1"/>
@@ -957,16 +176,13 @@
     </w:p>
     <w:p>
       <w:pPr>
-        <w:spacing w:after="200"/>
+        <w:spacing w:after="200" w:line="300" w:lineRule="auto"/>
       </w:pPr>
       <w:r>
         <w:rPr>
-          <w:b w:val="0"/>
-          <w:i/>
-          <w:color w:val="666666"/>
           <w:sz w:val="22"/>
         </w:rPr>
-        <w:t>Every pain collapses into one of two problems. Pick the matching bridge and deliver it.</w:t>
+        <w:t>Whatever they said in Q2 will fall into one of three problems: they need more volume, they need better quality, or their close rates are too low. You pick the bridge that matches what they told you and deliver it verbatim. These are written to sound conversational — say them the way you'd say any other sentence on the call.</w:t>
       </w:r>
     </w:p>
     <w:p>
@@ -978,35 +194,21 @@
           <w:b/>
           <w:sz w:val="24"/>
         </w:rPr>
-        <w:t>If the pain is VOLUME (not enough leads)</w:t>
+        <w:t>If they said they need more volume</w:t>
       </w:r>
     </w:p>
     <w:p>
       <w:pPr>
-        <w:spacing w:after="160"/>
-        <w:ind w:left="432"/>
+        <w:spacing w:after="240" w:line="300" w:lineRule="auto"/>
+        <w:ind w:left="504" w:right="288"/>
       </w:pPr>
       <w:r>
         <w:rPr>
           <w:i/>
-          <w:color w:val="444444"/>
+          <w:color w:val="333333"/>
           <w:sz w:val="22"/>
         </w:rPr>
-        <w:t>"Got it — and that's exactly why I reached out. On our call I'll show you how we're helping companies like Swag.com and Imprint Engine identify hundreds of companies every week who are attending large nearby events, opening new offices, or rebranding — basically companies already in buying mode for merch, so your team stops starting every month from zero."</w:t>
-      </w:r>
-    </w:p>
-    <w:p>
-      <w:pPr>
-        <w:spacing w:after="240"/>
-      </w:pPr>
-      <w:r>
-        <w:rPr>
-          <w:b w:val="0"/>
-          <w:i/>
-          <w:color w:val="888888"/>
-          <w:sz w:val="20"/>
-        </w:rPr>
-        <w:t>Use for: not enough volume · inconsistent · hard to scale · takes too long</w:t>
+        <w:t>"That's exactly why we're reaching out. We help our clients book 20-30 sales meetings every single month — consistently. The way we do it is by using AI to find people actually in the market right now — sponsoring big trade shows, opening new headquarters, or going through rebrands. Then we send them hundreds of personalized messages a day with custom merch mockups featuring their branding, so even at that scale it still feels personal. Would 15 minutes tomorrow or [next day] work? I can even show you a sample list of 100 prospects in [city]."</w:t>
       </w:r>
     </w:p>
     <w:p>
@@ -1018,35 +220,21 @@
           <w:b/>
           <w:sz w:val="24"/>
         </w:rPr>
-        <w:t>If the pain is QUALITY (not enough qualified leads)</w:t>
+        <w:t>If they said they need better qualification or more qualified leads</w:t>
       </w:r>
     </w:p>
     <w:p>
       <w:pPr>
-        <w:spacing w:after="160"/>
-        <w:ind w:left="432"/>
+        <w:spacing w:after="240" w:line="300" w:lineRule="auto"/>
+        <w:ind w:left="504" w:right="288"/>
       </w:pPr>
       <w:r>
         <w:rPr>
           <w:i/>
-          <w:color w:val="444444"/>
+          <w:color w:val="333333"/>
           <w:sz w:val="22"/>
         </w:rPr>
-        <w:t>"Got it — and that's exactly why I reached out. On our call I'll show you how we surface only companies with active buying intent — the ones attending events needing thousands of units, going through a rebrand, or opening new offices. So you're not wasting time on small accounts or window shoppers. We've used this same system to book meetings at Hilton, Stripe and Uber."</w:t>
-      </w:r>
-    </w:p>
-    <w:p>
-      <w:pPr>
-        <w:spacing w:after="240"/>
-      </w:pPr>
-      <w:r>
-        <w:rPr>
-          <w:b w:val="0"/>
-          <w:i/>
-          <w:color w:val="888888"/>
-          <w:sz w:val="20"/>
-        </w:rPr>
-        <w:t>Use for: bad lead quality · too expensive / bad ROI · can't measure what's working</w:t>
+        <w:t>"That's actually what we solve. A lot of times qualification comes down to timing — the prospects you're reaching might be a great fit overall, but they're just not actively in the market when you catch them. We use AI to find companies with real buying signals — trade shows, new headquarters, rebrands, hiring sprees — so every prospect your team reaches out to is actively looking for promo right now. Would 15 minutes tomorrow or [next day] work? I can show you a sample list of 100 prospects in [city]."</w:t>
       </w:r>
     </w:p>
     <w:p>
@@ -1058,21 +246,21 @@
           <w:b/>
           <w:sz w:val="24"/>
         </w:rPr>
-        <w:t>If they express both</w:t>
+        <w:t>If they said higher close rates or meetings don't convert</w:t>
       </w:r>
     </w:p>
     <w:p>
       <w:pPr>
-        <w:spacing w:after="160"/>
-        <w:ind w:left="432"/>
+        <w:spacing w:after="240" w:line="300" w:lineRule="auto"/>
+        <w:ind w:left="504" w:right="288"/>
       </w:pPr>
       <w:r>
         <w:rPr>
           <w:i/>
-          <w:color w:val="444444"/>
+          <w:color w:val="333333"/>
           <w:sz w:val="22"/>
         </w:rPr>
-        <w:t>"Got it — and that's exactly why I reached out. On our call I'll show you how we're helping companies like Swag.com and Imprint Engine get in front of hundreds of companies every week who are already in buying mode for merch — attending events, rebranding, opening offices — so you're not just getting more leads, you're getting the right ones. We've used this to book meetings at Hilton, Stripe and Uber."</w:t>
+        <w:t>"That's actually what we solve. A lot of times close rates come down to timing — the prospects you're meeting with might be a great fit, but they weren't actively in the market when you caught them. We use AI to find companies with real buying signals — trade shows, new headquarters, rebrands — so every prospect is actively looking for promo right now. And on top of that, once they respond positively, we handle all the back and forth for you — we qualify them, and then we book the meeting directly on your team's calendar. So your team just shows up and closes. Would 15 minutes tomorrow or [next day] work?"</w:t>
       </w:r>
     </w:p>
     <w:p>
@@ -1083,34 +271,18 @@
         <w:rPr>
           <w:color w:val="111111"/>
         </w:rPr>
-        <w:t>Close With the Ask</w:t>
+        <w:t>The Rules</w:t>
       </w:r>
     </w:p>
     <w:p>
       <w:pPr>
-        <w:spacing w:after="80"/>
+        <w:spacing w:after="200" w:line="300" w:lineRule="auto"/>
       </w:pPr>
       <w:r>
         <w:rPr>
-          <w:b w:val="0"/>
-          <w:i w:val="0"/>
           <w:sz w:val="22"/>
         </w:rPr>
-        <w:t>Straight after the bridge, no pause:</w:t>
-      </w:r>
-    </w:p>
-    <w:p>
-      <w:pPr>
-        <w:spacing w:after="160"/>
-        <w:ind w:left="432"/>
-      </w:pPr>
-      <w:r>
-        <w:rPr>
-          <w:i/>
-          <w:color w:val="444444"/>
-          <w:sz w:val="22"/>
-        </w:rPr>
-        <w:t>"So — is tomorrow or the day after better for a quick visual demo?"</w:t>
+        <w:t>Customize every response to what they actually said — don't run the volume bridge on someone who told you they have plenty of leads that aren't closing. Build only after Q2, never Q1. Sell, don't tell — your questions should make them say the pain, you shouldn't be lecturing them about it. And every pain admission has to be followed by a bridge. Never leave a pain statement hanging, and never skip the pivot into the value prop.</w:t>
       </w:r>
     </w:p>
     <w:p>
@@ -1121,147 +293,23 @@
         <w:rPr>
           <w:color w:val="111111"/>
         </w:rPr>
-        <w:t>The 4 Rules</w:t>
+        <w:t>Daily Drill</w:t>
       </w:r>
     </w:p>
     <w:p>
       <w:pPr>
-        <w:pStyle w:val="ListBullet"/>
-        <w:spacing w:after="60"/>
-      </w:pPr>
-      <w:r>
-        <w:rPr>
-          <w:b/>
-          <w:sz w:val="22"/>
-        </w:rPr>
-        <w:t xml:space="preserve">Customize, don't script. </w:t>
-      </w:r>
-      <w:r>
-        <w:rPr>
-          <w:sz w:val="22"/>
-        </w:rPr>
-        <w:t>Match the template to their actual answer.</w:t>
-      </w:r>
-    </w:p>
-    <w:p>
-      <w:pPr>
-        <w:pStyle w:val="ListBullet"/>
-        <w:spacing w:after="60"/>
-      </w:pPr>
-      <w:r>
-        <w:rPr>
-          <w:b/>
-          <w:sz w:val="22"/>
-        </w:rPr>
-        <w:t xml:space="preserve">Build comes after Q2 only. </w:t>
-      </w:r>
-      <w:r>
-        <w:rPr>
-          <w:sz w:val="22"/>
-        </w:rPr>
-        <w:t>Q1 is just context.</w:t>
-      </w:r>
-    </w:p>
-    <w:p>
-      <w:pPr>
-        <w:pStyle w:val="ListBullet"/>
-        <w:spacing w:after="60"/>
-      </w:pPr>
-      <w:r>
-        <w:rPr>
-          <w:b/>
-          <w:sz w:val="22"/>
-        </w:rPr>
-        <w:t xml:space="preserve">Sell, don't tell. </w:t>
-      </w:r>
-      <w:r>
-        <w:rPr>
-          <w:sz w:val="22"/>
-        </w:rPr>
-        <w:t>The build makes them say the pain — you don't lecture.</w:t>
-      </w:r>
-    </w:p>
-    <w:p>
-      <w:pPr>
-        <w:pStyle w:val="ListBullet"/>
-        <w:spacing w:after="60"/>
-      </w:pPr>
-      <w:r>
-        <w:rPr>
-          <w:b/>
-          <w:sz w:val="22"/>
-        </w:rPr>
-        <w:t xml:space="preserve">The bridge is mandatory. </w:t>
-      </w:r>
-      <w:r>
-        <w:rPr>
-          <w:sz w:val="22"/>
-        </w:rPr>
-        <w:t>Every pain admission must be followed by the bridge. Never leave pain hanging.</w:t>
-      </w:r>
-    </w:p>
-    <w:p>
-      <w:pPr>
-        <w:pStyle w:val="Heading1"/>
-      </w:pPr>
-      <w:r>
-        <w:rPr>
-          <w:color w:val="111111"/>
-        </w:rPr>
-        <w:t>Daily Drill (10 min before calls)</w:t>
-      </w:r>
-    </w:p>
-    <w:p>
-      <w:pPr>
-        <w:pStyle w:val="ListBullet"/>
-        <w:spacing w:after="60"/>
+        <w:spacing w:after="200" w:line="300" w:lineRule="auto"/>
       </w:pPr>
       <w:r>
         <w:rPr>
           <w:sz w:val="22"/>
         </w:rPr>
-        <w:t>Read the Q1 and Q2 tables out loud.</w:t>
-      </w:r>
-    </w:p>
-    <w:p>
-      <w:pPr>
-        <w:pStyle w:val="ListBullet"/>
-        <w:spacing w:after="60"/>
-      </w:pPr>
-      <w:r>
-        <w:rPr>
-          <w:sz w:val="22"/>
-        </w:rPr>
-        <w:t>Pick 3 random Q2 answers and run the full loop: acknowledge → build → bridge → ask.</w:t>
-      </w:r>
-    </w:p>
-    <w:p>
-      <w:pPr>
-        <w:pStyle w:val="ListBullet"/>
-        <w:spacing w:after="60"/>
-      </w:pPr>
-      <w:r>
-        <w:rPr>
-          <w:sz w:val="22"/>
-        </w:rPr>
-        <w:t>Alternate which bridge (volume vs quality) you're practicing.</w:t>
-      </w:r>
-    </w:p>
-    <w:p>
-      <w:pPr>
-        <w:pStyle w:val="ListBullet"/>
-        <w:spacing w:after="60"/>
-      </w:pPr>
-      <w:r>
-        <w:rPr>
-          <w:sz w:val="22"/>
-        </w:rPr>
-        <w:t>Rewatch 2 minutes of the training call once a week.</w:t>
+        <w:t>Ten minutes before every calling session, read the three value prop bridges out loud until they feel natural. Then pick three random pain points — volume, quality, close rate — and run the full loop in your head: acknowledge, build, bridge, ask for the meeting. Alternate which bridge you're practicing so all three stay sharp. Once a week, rewatch two minutes of the Apr 3 training call to stay calibrated.</w:t>
       </w:r>
     </w:p>
     <w:sectPr>
       <w:pgSz w:w="12240" w:h="15840"/>
-      <w:pgMar w:top="1152" w:right="1296" w:bottom="1152" w:left="1296" w:header="720" w:footer="720" w:gutter="0"/>
+      <w:pgMar w:top="1296" w:right="1440" w:bottom="1296" w:left="1440" w:header="720" w:footer="720" w:gutter="0"/>
       <w:cols w:space="720"/>
       <w:docGrid w:linePitch="360"/>
     </w:sectPr>

</xml_diff>

<commit_message>
Reframe qualification SOP for top-of-demo-call use
Remove booking ask from value prop bridges since qualification happens
on the already-booked demo call. Bridges now land with "that's exactly
what I'm going to show you today" and roll into the demo.

Rewrite Step 2 as an actual implication framework: anchor on their word
→ ask what it costs them → turn that cost into a "So..." question.
Replaces the previous "here are some examples" approach with a mental
procedure Lina can run in real time.

https://claude.ai/code/session_01M8FUH5cHcZxm3eABXjpd9F
</commit_message>
<xml_diff>
--- a/reports/qualification_sop.docx
+++ b/reports/qualification_sop.docx
@@ -32,7 +32,7 @@
         <w:rPr>
           <w:sz w:val="22"/>
         </w:rPr>
-        <w:t>The goal is simple: get the prospect to say the pain out loud themselves, then pivot straight into "here's how we're fixing exactly that on our call." Qualification isn't small talk — it's how you set up the pitch. Every question you ask has a job, and your job is to listen closely enough that your next sentence is built on what they just said, not on what your script says next.</w:t>
+        <w:t>This is what you run at the top of every demo call — after the prospect has agreed to the meeting and you're both on the line. The goal is simple: get them to say their pain out loud themselves, then pivot straight into "here's exactly what I'm going to show you today." Qualification isn't small talk — it's how you set up the demo so that everything you show them feels like it was built for their specific problem.</w:t>
       </w:r>
     </w:p>
     <w:p>
@@ -72,7 +72,7 @@
         <w:rPr>
           <w:sz w:val="22"/>
         </w:rPr>
-        <w:t>After every qualifying question, you do three things in order: acknowledge, build, and bridge. Acknowledge means repeating what they said in one short sentence so they feel heard. Build means asking an implication question that expands their pain — it gets them to admit the weakness in what they're doing without you pointing it out. And bridge means pivoting straight into the value prop: "On our call I'll show you exactly how we're fixing that."</w:t>
+        <w:t>After every qualifying question you do three things in order: acknowledge, build, and bridge. Acknowledge means repeating what they said in one short sentence so they feel heard. Build means asking an implication question that expands their pain — it gets them to admit the weakness in what they're doing without you pointing it out. And bridge means landing the value prop with the phrase "that's exactly what I'm going to show you today," then rolling straight into the demo.</w:t>
       </w:r>
     </w:p>
     <w:p>
@@ -83,7 +83,7 @@
         <w:rPr>
           <w:sz w:val="22"/>
         </w:rPr>
-        <w:t>The critical rule is that you only build after Q2. Q1 is just situational context — you acknowledge it and move straight on. The implication question is the money moment, and it only works once they've named the pain themselves. If you probe on Q1, you'll come off salesy and eat your own ammo before they've opened up.</w:t>
+        <w:t>The critical rule is that you only build after Q2. Q1 is just situational context — you acknowledge it and move straight on. The implication question is the money moment, and it only works once they've named a pain themselves. If you probe on Q1, you'll come off salesy and burn your ammo before they've opened up.</w:t>
       </w:r>
     </w:p>
     <w:p>
@@ -138,7 +138,75 @@
         <w:rPr>
           <w:sz w:val="22"/>
         </w:rPr>
-        <w:t>This is the money question. Whatever they say, your job is to reflect it back and immediately follow with one question that makes the pain bigger in their own head. You're not telling them anything — you're asking a question they have to answer, and the answer is what turns a complaint into a real pain point.</w:t>
+        <w:t>This is the money question. Whatever they say, your job is to reflect it back and immediately follow with one question that makes the pain bigger in their own head. You're not telling them anything — you're asking a question they have to answer, and the answer is what turns a complaint into a real pain point. The hard part is generating that implication question in real time, so here's the actual framework for doing it.</w:t>
+      </w:r>
+    </w:p>
+    <w:p>
+      <w:pPr>
+        <w:pStyle w:val="Heading2"/>
+      </w:pPr>
+      <w:r>
+        <w:rPr>
+          <w:color w:val="111111"/>
+        </w:rPr>
+        <w:t>How to Build the Implication Question</w:t>
+      </w:r>
+    </w:p>
+    <w:p>
+      <w:pPr>
+        <w:spacing w:after="200" w:line="300" w:lineRule="auto"/>
+      </w:pPr>
+      <w:r>
+        <w:rPr>
+          <w:b/>
+          <w:sz w:val="22"/>
+        </w:rPr>
+        <w:t xml:space="preserve">First, anchor on the word they used. </w:t>
+      </w:r>
+      <w:r>
+        <w:rPr>
+          <w:b w:val="0"/>
+          <w:sz w:val="22"/>
+        </w:rPr>
+        <w:t>Whatever pain they just named — "volume", "quality", "inconsistent", "close rate" — that's your starting point. Don't reach for something clever. Stay close to their language.</w:t>
+      </w:r>
+    </w:p>
+    <w:p>
+      <w:pPr>
+        <w:spacing w:after="200" w:line="300" w:lineRule="auto"/>
+      </w:pPr>
+      <w:r>
+        <w:rPr>
+          <w:b/>
+          <w:sz w:val="22"/>
+        </w:rPr>
+        <w:t xml:space="preserve">Second, ask yourself one question silently: what does this cost them if it doesn't change? </w:t>
+      </w:r>
+      <w:r>
+        <w:rPr>
+          <w:b w:val="0"/>
+          <w:sz w:val="22"/>
+        </w:rPr>
+        <w:t>You want to think one step past what they said. What's the natural downstream consequence? "Not enough volume" costs them growth. "Bad quality" costs them wasted rep time. "Inconsistent" costs them the ability to forecast. "Low close rate" costs them wasted meetings and an empty pipeline. You're not guessing — you're just extending their statement by one logical step.</w:t>
+      </w:r>
+    </w:p>
+    <w:p>
+      <w:pPr>
+        <w:spacing w:after="200" w:line="300" w:lineRule="auto"/>
+      </w:pPr>
+      <w:r>
+        <w:rPr>
+          <w:b/>
+          <w:sz w:val="22"/>
+        </w:rPr>
+        <w:t xml:space="preserve">Third, turn that cost into a question, usually starting with "So…" </w:t>
+      </w:r>
+      <w:r>
+        <w:rPr>
+          <w:b w:val="0"/>
+          <w:sz w:val="22"/>
+        </w:rPr>
+        <w:t>The formula is always the same: "So [the natural consequence of their pain]?" You're not adding new information, you're handing them back their own statement with one extra step on the end, and asking them to confirm it. If they say "not enough volume", you think "they can't grow," and you say "So what you're doing now isn't really giving you the growth you're looking for?" If they say "quality is bad," you think "reps are wasting time," and you say "So your team's spending a lot of time on accounts that don't end up buying?" If they say "meetings don't convert," you think "wasted pipeline," and you say "So your team's putting in the hours but the pipeline isn't really moving?"</w:t>
       </w:r>
     </w:p>
     <w:p>
@@ -149,18 +217,7 @@
         <w:rPr>
           <w:sz w:val="22"/>
         </w:rPr>
-        <w:t>If they say they need more volume, you come back with: "Yeah — and is what you're doing now actually giving you the growth you're looking for?" If they say the lead quality is bad, you say: "Got it — so a lot of the time you're talking to the wrong people or small accounts?" If they say their close rate is low, you say: "So the meetings are happening, but they're just not turning into deals?" If they say it's inconsistent, you say: "Makes sense — so you can't really forecast pipeline month to month?"</w:t>
-      </w:r>
-    </w:p>
-    <w:p>
-      <w:pPr>
-        <w:spacing w:after="200" w:line="300" w:lineRule="auto"/>
-      </w:pPr>
-      <w:r>
-        <w:rPr>
-          <w:sz w:val="22"/>
-        </w:rPr>
-        <w:t>The point isn't to memorize a response for every possible answer. The point is to always reflect first, then ask one question that makes them feel the pain a little deeper. Once they've admitted it a second time, you move straight into the bridge.</w:t>
+        <w:t>The reason this works is that you're not telling them their problem is bigger than they think — you're letting them say it themselves. Starting with "So…" makes it feel like a natural follow-up instead of an interrogation, and once they confirm the bigger version of the pain, you've locked it in. They've now said it twice. That's when you bridge.</w:t>
       </w:r>
     </w:p>
     <w:p>
@@ -182,7 +239,7 @@
         <w:rPr>
           <w:sz w:val="22"/>
         </w:rPr>
-        <w:t>Whatever they said in Q2 will fall into one of three problems: they need more volume, they need better quality, or their close rates are too low. You pick the bridge that matches what they told you and deliver it verbatim. These are written to sound conversational — say them the way you'd say any other sentence on the call.</w:t>
+        <w:t>Whatever they said in Q2 will fall into one of three buckets: they need more volume, they need better quality, or their close rates are too low. You pick the bridge that matches what they told you and deliver it almost verbatim. The bridge ends with the promise of the demo itself — no booking ask, no transition scripted in, just land the value and keep talking straight into the demo. These are written to sound conversational, so say them the way you'd say any other sentence on the call.</w:t>
       </w:r>
     </w:p>
     <w:p>
@@ -208,7 +265,7 @@
           <w:color w:val="333333"/>
           <w:sz w:val="22"/>
         </w:rPr>
-        <w:t>"That's exactly why we're reaching out. We help our clients book 20-30 sales meetings every single month — consistently. The way we do it is by using AI to find people actually in the market right now — sponsoring big trade shows, opening new headquarters, or going through rebrands. Then we send them hundreds of personalized messages a day with custom merch mockups featuring their branding, so even at that scale it still feels personal. Would 15 minutes tomorrow or [next day] work? I can even show you a sample list of 100 prospects in [city]."</w:t>
+        <w:t>"That's actually exactly what I'm going to show you today. We help our clients book 20-30 sales meetings every single month — consistently. The way we do it is by using AI to find people actually in the market right now — sponsoring big trade shows, opening new headquarters, or going through rebrands. Then we send them hundreds of personalized messages a day with custom merch mockups featuring their branding, so even at that scale it still feels personal."</w:t>
       </w:r>
     </w:p>
     <w:p>
@@ -234,7 +291,7 @@
           <w:color w:val="333333"/>
           <w:sz w:val="22"/>
         </w:rPr>
-        <w:t>"That's actually what we solve. A lot of times qualification comes down to timing — the prospects you're reaching might be a great fit overall, but they're just not actively in the market when you catch them. We use AI to find companies with real buying signals — trade shows, new headquarters, rebrands, hiring sprees — so every prospect your team reaches out to is actively looking for promo right now. Would 15 minutes tomorrow or [next day] work? I can show you a sample list of 100 prospects in [city]."</w:t>
+        <w:t>"That's actually exactly what I'm going to show you today. A lot of times qualification comes down to timing — the prospects you're reaching might be a great fit overall, but they're just not actively in the market when you catch them. We use AI to find companies with real buying signals — trade shows, new headquarters, rebrands, hiring sprees — so every prospect your team reaches out to is actively looking for promo right now."</w:t>
       </w:r>
     </w:p>
     <w:p>
@@ -246,7 +303,7 @@
           <w:b/>
           <w:sz w:val="24"/>
         </w:rPr>
-        <w:t>If they said higher close rates or meetings don't convert</w:t>
+        <w:t>If they said their close rate is low or meetings don't convert</w:t>
       </w:r>
     </w:p>
     <w:p>
@@ -260,7 +317,7 @@
           <w:color w:val="333333"/>
           <w:sz w:val="22"/>
         </w:rPr>
-        <w:t>"That's actually what we solve. A lot of times close rates come down to timing — the prospects you're meeting with might be a great fit, but they weren't actively in the market when you caught them. We use AI to find companies with real buying signals — trade shows, new headquarters, rebrands — so every prospect is actively looking for promo right now. And on top of that, once they respond positively, we handle all the back and forth for you — we qualify them, and then we book the meeting directly on your team's calendar. So your team just shows up and closes. Would 15 minutes tomorrow or [next day] work?"</w:t>
+        <w:t>"That's actually exactly what I'm going to show you today. A lot of times close rates come down to timing — the prospects you're meeting with might be a great fit, but they weren't actively in the market when you caught them. We use AI to find companies with real buying signals — trade shows, new headquarters, rebrands — so every prospect is actively looking for promo right now. And on top of that, once they respond positively, we handle all the back and forth for you — we qualify them, and then we book the meeting directly on your team's calendar. So your team just shows up and closes."</w:t>
       </w:r>
     </w:p>
     <w:p>
@@ -282,7 +339,7 @@
         <w:rPr>
           <w:sz w:val="22"/>
         </w:rPr>
-        <w:t>Customize every response to what they actually said — don't run the volume bridge on someone who told you they have plenty of leads that aren't closing. Build only after Q2, never Q1. Sell, don't tell — your questions should make them say the pain, you shouldn't be lecturing them about it. And every pain admission has to be followed by a bridge. Never leave a pain statement hanging, and never skip the pivot into the value prop.</w:t>
+        <w:t>Customize every response to what they actually said — don't run the volume bridge on someone who told you they have plenty of leads that aren't closing. Build only after Q2, never Q1. Sell, don't tell — your questions should make them say the pain, you shouldn't be lecturing them about it. And every pain admission has to be followed by a bridge. Never leave a pain statement hanging, and never skip landing the value prop before you start the demo.</w:t>
       </w:r>
     </w:p>
     <w:p>
@@ -304,7 +361,7 @@
         <w:rPr>
           <w:sz w:val="22"/>
         </w:rPr>
-        <w:t>Ten minutes before every calling session, read the three value prop bridges out loud until they feel natural. Then pick three random pain points — volume, quality, close rate — and run the full loop in your head: acknowledge, build, bridge, ask for the meeting. Alternate which bridge you're practicing so all three stay sharp. Once a week, rewatch two minutes of the Apr 3 training call to stay calibrated.</w:t>
+        <w:t>Ten minutes before every calling session, read the three value prop bridges out loud until they feel natural. Then pick three random pain points — volume, quality, close rate — and run the full loop in your head: acknowledge, build, bridge. Practice the build step especially: take a pain word, think about what it costs them if it doesn't change, then turn that cost into a "So…" question. Alternate which bridge you're practicing so all three stay sharp. Once a week, rewatch two minutes of the Apr 3 training call to stay calibrated.</w:t>
       </w:r>
     </w:p>
     <w:sectPr>

</xml_diff>

<commit_message>
Tighten qualification SOP and fix redundant bridges
Rewrite value prop bridges as short callbacks to the cold call pitch
instead of re-pitching buying signals and social proof. Reverse the
framing so the bridge says "remember that thing I mentioned? That's
what fixes this" in two or three sentences, then rolls into the demo.

Tighten all other sections: shorter paragraphs, bold inline labels for
key phrases (3-step loop, critical rule, implication framework steps),
more vertical spacing between sections for readability without adding
lists or tables.

https://claude.ai/code/session_01M8FUH5cHcZxm3eABXjpd9F
</commit_message>
<xml_diff>
--- a/reports/qualification_sop.docx
+++ b/reports/qualification_sop.docx
@@ -13,7 +13,7 @@
     </w:p>
     <w:p>
       <w:pPr>
-        <w:spacing w:after="320"/>
+        <w:spacing w:after="360"/>
       </w:pPr>
       <w:r>
         <w:rPr>
@@ -26,24 +26,24 @@
     </w:p>
     <w:p>
       <w:pPr>
-        <w:spacing w:after="200" w:line="300" w:lineRule="auto"/>
+        <w:spacing w:after="240" w:line="312" w:lineRule="auto"/>
       </w:pPr>
       <w:r>
         <w:rPr>
           <w:sz w:val="22"/>
         </w:rPr>
-        <w:t>This is what you run at the top of every demo call — after the prospect has agreed to the meeting and you're both on the line. The goal is simple: get them to say their pain out loud themselves, then pivot straight into "here's exactly what I'm going to show you today." Qualification isn't small talk — it's how you set up the demo so that everything you show them feels like it was built for their specific problem.</w:t>
+        <w:t>Run this at the top of every demo call, after the meeting's booked and you're both on the line. The goal is to get the prospect to say their pain out loud, then tie it back to what you already pitched on the cold call so everything you show them next feels custom-built for their problem.</w:t>
       </w:r>
     </w:p>
     <w:p>
       <w:pPr>
-        <w:spacing w:after="280" w:line="300" w:lineRule="auto"/>
+        <w:spacing w:after="360" w:line="312" w:lineRule="auto"/>
       </w:pPr>
       <w:r>
         <w:rPr>
           <w:sz w:val="22"/>
         </w:rPr>
-        <w:t xml:space="preserve">Before every calling session, rewatch our Apr 3 training call until this framework feels second nature — it walks through exactly this flow with live examples. Link: </w:t>
+        <w:t xml:space="preserve">Rewatch the Apr 3 training call before every session until this feels automatic: </w:t>
       </w:r>
       <w:r>
         <w:rPr>
@@ -56,6 +56,7 @@
     <w:p>
       <w:pPr>
         <w:pStyle w:val="Heading1"/>
+        <w:spacing w:before="360" w:after="160"/>
       </w:pPr>
       <w:r>
         <w:rPr>
@@ -66,29 +67,46 @@
     </w:p>
     <w:p>
       <w:pPr>
-        <w:spacing w:after="200" w:line="300" w:lineRule="auto"/>
+        <w:spacing w:after="240" w:line="312" w:lineRule="auto"/>
       </w:pPr>
       <w:r>
         <w:rPr>
+          <w:b/>
           <w:sz w:val="22"/>
         </w:rPr>
-        <w:t>After every qualifying question you do three things in order: acknowledge, build, and bridge. Acknowledge means repeating what they said in one short sentence so they feel heard. Build means asking an implication question that expands their pain — it gets them to admit the weakness in what they're doing without you pointing it out. And bridge means landing the value prop with the phrase "that's exactly what I'm going to show you today," then rolling straight into the demo.</w:t>
+        <w:t xml:space="preserve">Acknowledge → Build → Bridge. </w:t>
+      </w:r>
+      <w:r>
+        <w:rPr>
+          <w:b w:val="0"/>
+          <w:sz w:val="22"/>
+        </w:rPr>
+        <w:t>After every qualifying question: reflect what they said, hit them with an implication question that expands the pain, then pivot back into the value prop.</w:t>
       </w:r>
     </w:p>
     <w:p>
       <w:pPr>
-        <w:spacing w:after="200" w:line="300" w:lineRule="auto"/>
+        <w:spacing w:after="240" w:line="312" w:lineRule="auto"/>
       </w:pPr>
       <w:r>
         <w:rPr>
+          <w:b/>
           <w:sz w:val="22"/>
         </w:rPr>
-        <w:t>The critical rule is that you only build after Q2. Q1 is just situational context — you acknowledge it and move straight on. The implication question is the money moment, and it only works once they've named a pain themselves. If you probe on Q1, you'll come off salesy and burn your ammo before they've opened up.</w:t>
+        <w:t xml:space="preserve">Critical rule: </w:t>
+      </w:r>
+      <w:r>
+        <w:rPr>
+          <w:b w:val="0"/>
+          <w:sz w:val="22"/>
+        </w:rPr>
+        <w:t>only build after Q2. Q1 is situational context — acknowledge and move on. If you probe on Q1 you come off salesy before they've opened up, and you burn your ammo.</w:t>
       </w:r>
     </w:p>
     <w:p>
       <w:pPr>
         <w:pStyle w:val="Heading1"/>
+        <w:spacing w:before="360" w:after="160"/>
       </w:pPr>
       <w:r>
         <w:rPr>
@@ -99,29 +117,38 @@
     </w:p>
     <w:p>
       <w:pPr>
-        <w:spacing w:after="200" w:line="300" w:lineRule="auto"/>
+        <w:spacing w:after="240" w:line="312" w:lineRule="auto"/>
       </w:pPr>
       <w:r>
         <w:rPr>
           <w:sz w:val="22"/>
         </w:rPr>
-        <w:t>This question is purely situational. Don't probe, don't dig, don't follow up. Just reflect what they said in one short sentence and move straight to Q2. If they say referrals, you say "Got it, so mostly word of mouth." If they say Google Ads, you say "Okay, so paid search." If they tell you they've got an in-house SDR team, you say "Nice, so you've got a team running outbound." The pattern is the same for anything they tell you — one short reflection so they feel heard, then you move on.</w:t>
+        <w:t>Situational only. Reflect in one short sentence, then move straight to Q2. If they say referrals, "Got it, so mostly word of mouth." If Google Ads, "Okay, so paid search." If they've got an in-house SDR team, "Nice, so you've got a team running outbound." Same pattern for anything they tell you.</w:t>
       </w:r>
     </w:p>
     <w:p>
       <w:pPr>
-        <w:spacing w:after="200" w:line="300" w:lineRule="auto"/>
+        <w:spacing w:after="240" w:line="312" w:lineRule="auto"/>
       </w:pPr>
       <w:r>
         <w:rPr>
+          <w:b w:val="0"/>
           <w:sz w:val="22"/>
         </w:rPr>
-        <w:t>If they give you a one-word answer and go silent on you, the fallback is neutral — not a probe. Something like "Got it — anything else, or is that the main channel?" That keeps them talking without making it feel like an interrogation.</w:t>
+        <w:t xml:space="preserve">If they go silent, use a neutral fallback, not a probe: </w:t>
+      </w:r>
+      <w:r>
+        <w:rPr>
+          <w:b/>
+          <w:sz w:val="22"/>
+        </w:rPr>
+        <w:t>"Got it — anything else, or is that the main channel?"</w:t>
       </w:r>
     </w:p>
     <w:p>
       <w:pPr>
         <w:pStyle w:val="Heading1"/>
+        <w:spacing w:before="360" w:after="160"/>
       </w:pPr>
       <w:r>
         <w:rPr>
@@ -132,18 +159,19 @@
     </w:p>
     <w:p>
       <w:pPr>
-        <w:spacing w:after="200" w:line="300" w:lineRule="auto"/>
+        <w:spacing w:after="240" w:line="312" w:lineRule="auto"/>
       </w:pPr>
       <w:r>
         <w:rPr>
           <w:sz w:val="22"/>
         </w:rPr>
-        <w:t>This is the money question. Whatever they say, your job is to reflect it back and immediately follow with one question that makes the pain bigger in their own head. You're not telling them anything — you're asking a question they have to answer, and the answer is what turns a complaint into a real pain point. The hard part is generating that implication question in real time, so here's the actual framework for doing it.</w:t>
+        <w:t>This is the money question. Reflect what they said, then hit them with one implication question that makes the pain bigger in their own head. You're not telling them anything — they do the work.</w:t>
       </w:r>
     </w:p>
     <w:p>
       <w:pPr>
         <w:pStyle w:val="Heading2"/>
+        <w:spacing w:before="240" w:after="120"/>
       </w:pPr>
       <w:r>
         <w:rPr>
@@ -154,75 +182,95 @@
     </w:p>
     <w:p>
       <w:pPr>
-        <w:spacing w:after="200" w:line="300" w:lineRule="auto"/>
+        <w:spacing w:after="240" w:line="312" w:lineRule="auto"/>
       </w:pPr>
       <w:r>
         <w:rPr>
           <w:b/>
           <w:sz w:val="22"/>
         </w:rPr>
-        <w:t xml:space="preserve">First, anchor on the word they used. </w:t>
+        <w:t xml:space="preserve">1. Anchor on their word. </w:t>
       </w:r>
       <w:r>
         <w:rPr>
           <w:b w:val="0"/>
           <w:sz w:val="22"/>
         </w:rPr>
-        <w:t>Whatever pain they just named — "volume", "quality", "inconsistent", "close rate" — that's your starting point. Don't reach for something clever. Stay close to their language.</w:t>
+        <w:t>Whatever they named — "volume", "quality", "inconsistent", "close rate" — stay close to that. Don't reach for clever.</w:t>
       </w:r>
     </w:p>
     <w:p>
       <w:pPr>
-        <w:spacing w:after="200" w:line="300" w:lineRule="auto"/>
+        <w:spacing w:after="240" w:line="312" w:lineRule="auto"/>
       </w:pPr>
       <w:r>
         <w:rPr>
           <w:b/>
           <w:sz w:val="22"/>
         </w:rPr>
-        <w:t xml:space="preserve">Second, ask yourself one question silently: what does this cost them if it doesn't change? </w:t>
+        <w:t xml:space="preserve">2. Ask yourself silently: what does this cost them? </w:t>
       </w:r>
       <w:r>
         <w:rPr>
           <w:b w:val="0"/>
           <w:sz w:val="22"/>
         </w:rPr>
-        <w:t>You want to think one step past what they said. What's the natural downstream consequence? "Not enough volume" costs them growth. "Bad quality" costs them wasted rep time. "Inconsistent" costs them the ability to forecast. "Low close rate" costs them wasted meetings and an empty pipeline. You're not guessing — you're just extending their statement by one logical step.</w:t>
+        <w:t>Think one step past what they said. Volume → can't grow. Quality → reps waste time. Inconsistent → can't forecast. Low close rate → wasted meetings.</w:t>
       </w:r>
     </w:p>
     <w:p>
       <w:pPr>
-        <w:spacing w:after="200" w:line="300" w:lineRule="auto"/>
+        <w:spacing w:after="240" w:line="312" w:lineRule="auto"/>
       </w:pPr>
       <w:r>
         <w:rPr>
           <w:b/>
           <w:sz w:val="22"/>
         </w:rPr>
-        <w:t xml:space="preserve">Third, turn that cost into a question, usually starting with "So…" </w:t>
+        <w:t xml:space="preserve">3. Turn that cost into a "So…" question. </w:t>
       </w:r>
       <w:r>
         <w:rPr>
           <w:b w:val="0"/>
           <w:sz w:val="22"/>
         </w:rPr>
-        <w:t>The formula is always the same: "So [the natural consequence of their pain]?" You're not adding new information, you're handing them back their own statement with one extra step on the end, and asking them to confirm it. If they say "not enough volume", you think "they can't grow," and you say "So what you're doing now isn't really giving you the growth you're looking for?" If they say "quality is bad," you think "reps are wasting time," and you say "So your team's spending a lot of time on accounts that don't end up buying?" If they say "meetings don't convert," you think "wasted pipeline," and you say "So your team's putting in the hours but the pipeline isn't really moving?"</w:t>
+        <w:t>Formula: "So [the consequence of their pain]?" You're handing them back their own statement with one extra step on the end, and asking them to confirm it.</w:t>
       </w:r>
     </w:p>
     <w:p>
       <w:pPr>
-        <w:spacing w:after="200" w:line="300" w:lineRule="auto"/>
+        <w:spacing w:after="240" w:line="312" w:lineRule="auto"/>
+      </w:pPr>
+      <w:r>
+        <w:rPr>
+          <w:b/>
+          <w:sz w:val="22"/>
+        </w:rPr>
+        <w:t xml:space="preserve">Example: </w:t>
+      </w:r>
+      <w:r>
+        <w:rPr>
+          <w:b w:val="0"/>
+          <w:sz w:val="22"/>
+        </w:rPr>
+        <w:t>they say "not enough volume," you think "they can't grow," you say "So what you're doing now isn't really giving you the growth you're looking for?"</w:t>
+      </w:r>
+    </w:p>
+    <w:p>
+      <w:pPr>
+        <w:spacing w:after="240" w:line="312" w:lineRule="auto"/>
       </w:pPr>
       <w:r>
         <w:rPr>
           <w:sz w:val="22"/>
         </w:rPr>
-        <w:t>The reason this works is that you're not telling them their problem is bigger than they think — you're letting them say it themselves. Starting with "So…" makes it feel like a natural follow-up instead of an interrogation, and once they confirm the bigger version of the pain, you've locked it in. They've now said it twice. That's when you bridge.</w:t>
+        <w:t>It works because you're not telling them their problem is bigger — you're letting them say it themselves. Starting with "So…" makes it feel like a natural follow-up, not an interrogation. Once they confirm, the pain is locked in and you bridge.</w:t>
       </w:r>
     </w:p>
     <w:p>
       <w:pPr>
         <w:pStyle w:val="Heading1"/>
+        <w:spacing w:before="360" w:after="160"/>
       </w:pPr>
       <w:r>
         <w:rPr>
@@ -233,18 +281,37 @@
     </w:p>
     <w:p>
       <w:pPr>
-        <w:spacing w:after="200" w:line="300" w:lineRule="auto"/>
+        <w:spacing w:after="240" w:line="312" w:lineRule="auto"/>
       </w:pPr>
       <w:r>
         <w:rPr>
           <w:sz w:val="22"/>
         </w:rPr>
-        <w:t>Whatever they said in Q2 will fall into one of three buckets: they need more volume, they need better quality, or their close rates are too low. You pick the bridge that matches what they told you and deliver it almost verbatim. The bridge ends with the promise of the demo itself — no booking ask, no transition scripted in, just land the value and keep talking straight into the demo. These are written to sound conversational, so say them the way you'd say any other sentence on the call.</w:t>
+        <w:t>Whatever they said falls into one of three buckets: volume, quality, or close rate. Pick the matching bridge.</w:t>
       </w:r>
     </w:p>
     <w:p>
       <w:pPr>
-        <w:spacing w:after="80"/>
+        <w:spacing w:after="240" w:line="312" w:lineRule="auto"/>
+      </w:pPr>
+      <w:r>
+        <w:rPr>
+          <w:b/>
+          <w:sz w:val="22"/>
+        </w:rPr>
+        <w:t xml:space="preserve">The bridge is a short callback, not a second pitch. </w:t>
+      </w:r>
+      <w:r>
+        <w:rPr>
+          <w:b w:val="0"/>
+          <w:sz w:val="22"/>
+        </w:rPr>
+        <w:t>They already heard the buying signals, the custom merch mockups, Hilton and Stripe on the cold call — repeating any of that makes you sound scripted. Reverse the framing. On the cold call you said "here's what we do." Now you're saying "remember that thing I mentioned? That's exactly what fixes this." Two or three sentences max, then straight into the demo.</w:t>
+      </w:r>
+    </w:p>
+    <w:p>
+      <w:pPr>
+        <w:spacing w:before="120" w:after="80"/>
       </w:pPr>
       <w:r>
         <w:rPr>
@@ -256,7 +323,7 @@
     </w:p>
     <w:p>
       <w:pPr>
-        <w:spacing w:after="240" w:line="300" w:lineRule="auto"/>
+        <w:spacing w:after="280" w:line="312" w:lineRule="auto"/>
         <w:ind w:left="504" w:right="288"/>
       </w:pPr>
       <w:r>
@@ -265,12 +332,12 @@
           <w:color w:val="333333"/>
           <w:sz w:val="22"/>
         </w:rPr>
-        <w:t>"That's actually exactly what I'm going to show you today. We help our clients book 20-30 sales meetings every single month — consistently. The way we do it is by using AI to find people actually in the market right now — sponsoring big trade shows, opening new headquarters, or going through rebrands. Then we send them hundreds of personalized messages a day with custom merch mockups featuring their branding, so even at that scale it still feels personal."</w:t>
+        <w:t>"Got it — and that's exactly what I was talking about earlier. I'm going to walk you through today how we get our clients 20-30 meetings a month, consistently, using those buying signals I mentioned — so your team stops starting every month from zero."</w:t>
       </w:r>
     </w:p>
     <w:p>
       <w:pPr>
-        <w:spacing w:after="80"/>
+        <w:spacing w:before="120" w:after="80"/>
       </w:pPr>
       <w:r>
         <w:rPr>
@@ -282,7 +349,7 @@
     </w:p>
     <w:p>
       <w:pPr>
-        <w:spacing w:after="240" w:line="300" w:lineRule="auto"/>
+        <w:spacing w:after="280" w:line="312" w:lineRule="auto"/>
         <w:ind w:left="504" w:right="288"/>
       </w:pPr>
       <w:r>
@@ -291,12 +358,12 @@
           <w:color w:val="333333"/>
           <w:sz w:val="22"/>
         </w:rPr>
-        <w:t>"That's actually exactly what I'm going to show you today. A lot of times qualification comes down to timing — the prospects you're reaching might be a great fit overall, but they're just not actively in the market when you catch them. We use AI to find companies with real buying signals — trade shows, new headquarters, rebrands, hiring sprees — so every prospect your team reaches out to is actively looking for promo right now."</w:t>
+        <w:t>"Got it — and that's exactly what those buying signals I mentioned are for. A lot of the time it comes down to timing: the prospects you're reaching are a fine fit, they're just not in market when you catch them. I'll show you today how we fix that."</w:t>
       </w:r>
     </w:p>
     <w:p>
       <w:pPr>
-        <w:spacing w:after="80"/>
+        <w:spacing w:before="120" w:after="80"/>
       </w:pPr>
       <w:r>
         <w:rPr>
@@ -308,7 +375,7 @@
     </w:p>
     <w:p>
       <w:pPr>
-        <w:spacing w:after="240" w:line="300" w:lineRule="auto"/>
+        <w:spacing w:after="280" w:line="312" w:lineRule="auto"/>
         <w:ind w:left="504" w:right="288"/>
       </w:pPr>
       <w:r>
@@ -317,12 +384,13 @@
           <w:color w:val="333333"/>
           <w:sz w:val="22"/>
         </w:rPr>
-        <w:t>"That's actually exactly what I'm going to show you today. A lot of times close rates come down to timing — the prospects you're meeting with might be a great fit, but they weren't actively in the market when you caught them. We use AI to find companies with real buying signals — trade shows, new headquarters, rebrands — so every prospect is actively looking for promo right now. And on top of that, once they respond positively, we handle all the back and forth for you — we qualify them, and then we book the meeting directly on your team's calendar. So your team just shows up and closes."</w:t>
+        <w:t>"Got it — and this is actually where we go a step beyond what I mentioned on the first call. On top of finding prospects in market, once they respond we handle all the back and forth, qualify them, and book the meeting straight onto your team's calendar. So your team only shows up to conversations ready to close. I'll walk you through how it works today."</w:t>
       </w:r>
     </w:p>
     <w:p>
       <w:pPr>
         <w:pStyle w:val="Heading1"/>
+        <w:spacing w:before="360" w:after="160"/>
       </w:pPr>
       <w:r>
         <w:rPr>
@@ -333,18 +401,19 @@
     </w:p>
     <w:p>
       <w:pPr>
-        <w:spacing w:after="200" w:line="300" w:lineRule="auto"/>
+        <w:spacing w:after="240" w:line="312" w:lineRule="auto"/>
       </w:pPr>
       <w:r>
         <w:rPr>
           <w:sz w:val="22"/>
         </w:rPr>
-        <w:t>Customize every response to what they actually said — don't run the volume bridge on someone who told you they have plenty of leads that aren't closing. Build only after Q2, never Q1. Sell, don't tell — your questions should make them say the pain, you shouldn't be lecturing them about it. And every pain admission has to be followed by a bridge. Never leave a pain statement hanging, and never skip landing the value prop before you start the demo.</w:t>
+        <w:t>Match the bridge to what they actually said. Build only after Q2, never Q1. Sell, don't tell — make them say the pain. Never leave a pain statement hanging without a bridge.</w:t>
       </w:r>
     </w:p>
     <w:p>
       <w:pPr>
         <w:pStyle w:val="Heading1"/>
+        <w:spacing w:before="360" w:after="160"/>
       </w:pPr>
       <w:r>
         <w:rPr>
@@ -355,13 +424,13 @@
     </w:p>
     <w:p>
       <w:pPr>
-        <w:spacing w:after="200" w:line="300" w:lineRule="auto"/>
+        <w:spacing w:after="240" w:line="312" w:lineRule="auto"/>
       </w:pPr>
       <w:r>
         <w:rPr>
           <w:sz w:val="22"/>
         </w:rPr>
-        <w:t>Ten minutes before every calling session, read the three value prop bridges out loud until they feel natural. Then pick three random pain points — volume, quality, close rate — and run the full loop in your head: acknowledge, build, bridge. Practice the build step especially: take a pain word, think about what it costs them if it doesn't change, then turn that cost into a "So…" question. Alternate which bridge you're practicing so all three stay sharp. Once a week, rewatch two minutes of the Apr 3 training call to stay calibrated.</w:t>
+        <w:t>Ten minutes before every calling session, read the three bridges out loud. Pick three random pain points — volume, quality, close rate — and run the full loop in your head: acknowledge, build, bridge. Practice the build step especially: anchor word → cost → "So…" question. Rewatch two minutes of the training call once a week to stay calibrated.</w:t>
       </w:r>
     </w:p>
     <w:sectPr>

</xml_diff>

<commit_message>
Rewrite SOP as full post-booking flow
Replace the qualification-only doc with the full Post-Booking
Qualification & Scheduling SOP: cardinal rule, Phase 6.1 transition,
Phase 6.2 qualification (new 3-step loop framework for Q1/Q2, kept Q3
budget from old SOP), Phase 6.3 disqualification, Phase 7 scheduling
mastery.

Fix bridge language: no more "I'm going to walk you through today"
since the call may be on another day and the founder runs the demo,
not Lina. Bridges now say "on the call, our founder will walk you
through..."

https://claude.ai/code/session_01M8FUH5cHcZxm3eABXjpd9F
</commit_message>
<xml_diff>
--- a/reports/qualification_sop.docx
+++ b/reports/qualification_sop.docx
@@ -8,7 +8,7 @@
         <w:jc w:val="left"/>
       </w:pPr>
       <w:r>
-        <w:t>Qualification SOP</w:t>
+        <w:t>Post-Booking Qualification &amp; Scheduling SOP</w:t>
       </w:r>
     </w:p>
     <w:p>
@@ -21,7 +21,28 @@
           <w:color w:val="666666"/>
           <w:sz w:val="24"/>
         </w:rPr>
-        <w:t>How to qualify without sounding like a robot</w:t>
+        <w:t>How to qualify without killing show-up rate</w:t>
+      </w:r>
+    </w:p>
+    <w:p>
+      <w:pPr>
+        <w:spacing w:after="240" w:line="312" w:lineRule="auto"/>
+      </w:pPr>
+      <w:r>
+        <w:rPr>
+          <w:b/>
+          <w:i w:val="0"/>
+          <w:sz w:val="22"/>
+        </w:rPr>
+        <w:t xml:space="preserve">The cardinal rule: secure the call first, qualify second. </w:t>
+      </w:r>
+      <w:r>
+        <w:rPr>
+          <w:b w:val="0"/>
+          <w:i w:val="0"/>
+          <w:sz w:val="22"/>
+        </w:rPr>
+        <w:t>Never interrogate a prospect before you have them on the calendar. The cold call is not a discovery call. Once they agree to a time and you send the calendar invite, then you ask qualifying questions. Not before.</w:t>
       </w:r>
     </w:p>
     <w:p>
@@ -32,12 +53,12 @@
         <w:rPr>
           <w:sz w:val="22"/>
         </w:rPr>
-        <w:t>Run this at the top of every demo call, after the meeting's booked and you're both on the line. The goal is to get the prospect to say their pain out loud, then tie it back to what you already pitched on the cold call so everything you show them next feels custom-built for their problem.</w:t>
+        <w:t>And the qualification phase isn't just an interview to see if they fit the ICP. The primary goal is to make sure they actually show up to the meeting. The secondary goal is to qualify them. If you mechanically ask three questions and hang up, you get a robotic "yes" and a no-show. You have to build a conversation that creates curiosity, builds on their pain, and ties everything back to what they'll see on the call.</w:t>
       </w:r>
     </w:p>
     <w:p>
       <w:pPr>
-        <w:spacing w:after="360" w:line="312" w:lineRule="auto"/>
+        <w:spacing w:after="320" w:line="312" w:lineRule="auto"/>
       </w:pPr>
       <w:r>
         <w:rPr>
@@ -56,7 +77,67 @@
     <w:p>
       <w:pPr>
         <w:pStyle w:val="Heading1"/>
-        <w:spacing w:before="360" w:after="160"/>
+        <w:spacing w:before="400" w:after="160"/>
+      </w:pPr>
+      <w:r>
+        <w:rPr>
+          <w:color w:val="111111"/>
+        </w:rPr>
+        <w:t>Phase 6.1 — The Transition</w:t>
+      </w:r>
+    </w:p>
+    <w:p>
+      <w:pPr>
+        <w:spacing w:after="240" w:line="312" w:lineRule="auto"/>
+      </w:pPr>
+      <w:r>
+        <w:rPr>
+          <w:sz w:val="22"/>
+        </w:rPr>
+        <w:t>Once the invite is sent, transition like this:</w:t>
+      </w:r>
+    </w:p>
+    <w:p>
+      <w:pPr>
+        <w:spacing w:after="280" w:line="312" w:lineRule="auto"/>
+        <w:ind w:left="504" w:right="288"/>
+      </w:pPr>
+      <w:r>
+        <w:rPr>
+          <w:i/>
+          <w:color w:val="333333"/>
+          <w:sz w:val="22"/>
+        </w:rPr>
+        <w:t>"Awesome, the invite is sent. Before I let you go, I just have three quickfire questions to make the call as relevant to you as possible and make sure it's the best fit. Sound good?"</w:t>
+      </w:r>
+    </w:p>
+    <w:p>
+      <w:pPr>
+        <w:spacing w:after="240" w:line="312" w:lineRule="auto"/>
+      </w:pPr>
+      <w:r>
+        <w:rPr>
+          <w:sz w:val="22"/>
+        </w:rPr>
+        <w:t>"Quickfire questions" signals brevity. "Make the call relevant to you" frames them as being for the prospect's benefit, not yours.</w:t>
+      </w:r>
+    </w:p>
+    <w:p>
+      <w:pPr>
+        <w:pStyle w:val="Heading1"/>
+        <w:spacing w:before="400" w:after="160"/>
+      </w:pPr>
+      <w:r>
+        <w:rPr>
+          <w:color w:val="111111"/>
+        </w:rPr>
+        <w:t>Phase 6.2 — The Qualification Framework</w:t>
+      </w:r>
+    </w:p>
+    <w:p>
+      <w:pPr>
+        <w:pStyle w:val="Heading2"/>
+        <w:spacing w:before="280" w:after="120"/>
       </w:pPr>
       <w:r>
         <w:rPr>
@@ -72,6 +153,7 @@
       <w:r>
         <w:rPr>
           <w:b/>
+          <w:i w:val="0"/>
           <w:sz w:val="22"/>
         </w:rPr>
         <w:t xml:space="preserve">Acknowledge → Build → Bridge. </w:t>
@@ -79,9 +161,10 @@
       <w:r>
         <w:rPr>
           <w:b w:val="0"/>
+          <w:i w:val="0"/>
           <w:sz w:val="22"/>
         </w:rPr>
-        <w:t>After every qualifying question: reflect what they said, hit them with an implication question that expands the pain, then pivot back into the value prop.</w:t>
+        <w:t>After every qualifying question: reflect what they said, hit them with an implication question that expands the pain, then tie it back to the call with a short callback to what you already pitched.</w:t>
       </w:r>
     </w:p>
     <w:p>
@@ -91,6 +174,7 @@
       <w:r>
         <w:rPr>
           <w:b/>
+          <w:i w:val="0"/>
           <w:sz w:val="22"/>
         </w:rPr>
         <w:t xml:space="preserve">Critical rule: </w:t>
@@ -98,6 +182,7 @@
       <w:r>
         <w:rPr>
           <w:b w:val="0"/>
+          <w:i w:val="0"/>
           <w:sz w:val="22"/>
         </w:rPr>
         <w:t>only build after Q2. Q1 is situational context — acknowledge and move on. If you probe on Q1 you come off salesy before they've opened up, and you burn your ammo.</w:t>
@@ -105,8 +190,8 @@
     </w:p>
     <w:p>
       <w:pPr>
-        <w:pStyle w:val="Heading1"/>
-        <w:spacing w:before="360" w:after="160"/>
+        <w:pStyle w:val="Heading2"/>
+        <w:spacing w:before="280" w:after="120"/>
       </w:pPr>
       <w:r>
         <w:rPr>
@@ -133,13 +218,15 @@
       <w:r>
         <w:rPr>
           <w:b w:val="0"/>
+          <w:i w:val="0"/>
           <w:sz w:val="22"/>
         </w:rPr>
         <w:t xml:space="preserve">If they go silent, use a neutral fallback, not a probe: </w:t>
       </w:r>
       <w:r>
         <w:rPr>
-          <w:b/>
+          <w:b w:val="0"/>
+          <w:i/>
           <w:sz w:val="22"/>
         </w:rPr>
         <w:t>"Got it — anything else, or is that the main channel?"</w:t>
@@ -147,8 +234,8 @@
     </w:p>
     <w:p>
       <w:pPr>
-        <w:pStyle w:val="Heading1"/>
-        <w:spacing w:before="360" w:after="160"/>
+        <w:pStyle w:val="Heading2"/>
+        <w:spacing w:before="280" w:after="120"/>
       </w:pPr>
       <w:r>
         <w:rPr>
@@ -170,8 +257,8 @@
     </w:p>
     <w:p>
       <w:pPr>
-        <w:pStyle w:val="Heading2"/>
-        <w:spacing w:before="240" w:after="120"/>
+        <w:pStyle w:val="Heading3"/>
+        <w:spacing w:before="200" w:after="80"/>
       </w:pPr>
       <w:r>
         <w:rPr>
@@ -187,6 +274,7 @@
       <w:r>
         <w:rPr>
           <w:b/>
+          <w:i w:val="0"/>
           <w:sz w:val="22"/>
         </w:rPr>
         <w:t xml:space="preserve">1. Anchor on their word. </w:t>
@@ -194,6 +282,7 @@
       <w:r>
         <w:rPr>
           <w:b w:val="0"/>
+          <w:i w:val="0"/>
           <w:sz w:val="22"/>
         </w:rPr>
         <w:t>Whatever they named — "volume", "quality", "inconsistent", "close rate" — stay close to that. Don't reach for clever.</w:t>
@@ -206,6 +295,7 @@
       <w:r>
         <w:rPr>
           <w:b/>
+          <w:i w:val="0"/>
           <w:sz w:val="22"/>
         </w:rPr>
         <w:t xml:space="preserve">2. Ask yourself silently: what does this cost them? </w:t>
@@ -213,6 +303,7 @@
       <w:r>
         <w:rPr>
           <w:b w:val="0"/>
+          <w:i w:val="0"/>
           <w:sz w:val="22"/>
         </w:rPr>
         <w:t>Think one step past what they said. Volume → can't grow. Quality → reps waste time. Inconsistent → can't forecast. Low close rate → wasted meetings.</w:t>
@@ -225,6 +316,7 @@
       <w:r>
         <w:rPr>
           <w:b/>
+          <w:i w:val="0"/>
           <w:sz w:val="22"/>
         </w:rPr>
         <w:t xml:space="preserve">3. Turn that cost into a "So…" question. </w:t>
@@ -232,6 +324,7 @@
       <w:r>
         <w:rPr>
           <w:b w:val="0"/>
+          <w:i w:val="0"/>
           <w:sz w:val="22"/>
         </w:rPr>
         <w:t>Formula: "So [the consequence of their pain]?" You're handing them back their own statement with one extra step on the end, and asking them to confirm it.</w:t>
@@ -244,6 +337,7 @@
       <w:r>
         <w:rPr>
           <w:b/>
+          <w:i w:val="0"/>
           <w:sz w:val="22"/>
         </w:rPr>
         <w:t xml:space="preserve">Example: </w:t>
@@ -251,6 +345,7 @@
       <w:r>
         <w:rPr>
           <w:b w:val="0"/>
+          <w:i w:val="0"/>
           <w:sz w:val="22"/>
         </w:rPr>
         <w:t>they say "not enough volume," you think "they can't grow," you say "So what you're doing now isn't really giving you the growth you're looking for?"</w:t>
@@ -269,8 +364,8 @@
     </w:p>
     <w:p>
       <w:pPr>
-        <w:pStyle w:val="Heading1"/>
-        <w:spacing w:before="360" w:after="160"/>
+        <w:pStyle w:val="Heading3"/>
+        <w:spacing w:before="200" w:after="80"/>
       </w:pPr>
       <w:r>
         <w:rPr>
@@ -297,6 +392,7 @@
       <w:r>
         <w:rPr>
           <w:b/>
+          <w:i w:val="0"/>
           <w:sz w:val="22"/>
         </w:rPr>
         <w:t xml:space="preserve">The bridge is a short callback, not a second pitch. </w:t>
@@ -304,19 +400,20 @@
       <w:r>
         <w:rPr>
           <w:b w:val="0"/>
+          <w:i w:val="0"/>
           <w:sz w:val="22"/>
         </w:rPr>
-        <w:t>They already heard the buying signals, the custom merch mockups, Hilton and Stripe on the cold call — repeating any of that makes you sound scripted. Reverse the framing. On the cold call you said "here's what we do." Now you're saying "remember that thing I mentioned? That's exactly what fixes this." Two or three sentences max, then straight into the demo.</w:t>
+        <w:t>They already heard the buying signals, the custom merch mockups, Hilton and Stripe on the cold call — repeating any of that makes you sound scripted. Reverse the framing. On the cold call you said "here's what we do." Now you're saying "remember that thing I mentioned? That's exactly what fixes this." Two or three sentences max, then the next question.</w:t>
       </w:r>
     </w:p>
     <w:p>
       <w:pPr>
-        <w:spacing w:before="120" w:after="80"/>
+        <w:spacing w:before="160" w:after="80"/>
       </w:pPr>
       <w:r>
         <w:rPr>
           <w:b/>
-          <w:sz w:val="24"/>
+          <w:sz w:val="22"/>
         </w:rPr>
         <w:t>If they said they need more volume</w:t>
       </w:r>
@@ -332,17 +429,17 @@
           <w:color w:val="333333"/>
           <w:sz w:val="22"/>
         </w:rPr>
-        <w:t>"Got it — and that's exactly what I was talking about earlier. I'm going to walk you through today how we get our clients 20-30 meetings a month, consistently, using those buying signals I mentioned — so your team stops starting every month from zero."</w:t>
+        <w:t>"Got it — and that's exactly what we were talking about earlier. On the call, our founder is going to walk you through how we get our clients 20-30 meetings a month, consistently, using those buying signals I mentioned — so your team stops starting every month from zero."</w:t>
       </w:r>
     </w:p>
     <w:p>
       <w:pPr>
-        <w:spacing w:before="120" w:after="80"/>
+        <w:spacing w:before="160" w:after="80"/>
       </w:pPr>
       <w:r>
         <w:rPr>
           <w:b/>
-          <w:sz w:val="24"/>
+          <w:sz w:val="22"/>
         </w:rPr>
         <w:t>If they said they need better qualification or more qualified leads</w:t>
       </w:r>
@@ -358,17 +455,17 @@
           <w:color w:val="333333"/>
           <w:sz w:val="22"/>
         </w:rPr>
-        <w:t>"Got it — and that's exactly what those buying signals I mentioned are for. A lot of the time it comes down to timing: the prospects you're reaching are a fine fit, they're just not in market when you catch them. I'll show you today how we fix that."</w:t>
+        <w:t>"Got it — and that's exactly what those buying signals I mentioned are for. A lot of the time it comes down to timing: the prospects you're reaching are a fine fit, they're just not in market when you catch them. On the call, our founder will show you exactly how we fix that."</w:t>
       </w:r>
     </w:p>
     <w:p>
       <w:pPr>
-        <w:spacing w:before="120" w:after="80"/>
+        <w:spacing w:before="160" w:after="80"/>
       </w:pPr>
       <w:r>
         <w:rPr>
           <w:b/>
-          <w:sz w:val="24"/>
+          <w:sz w:val="22"/>
         </w:rPr>
         <w:t>If they said their close rate is low or meetings don't convert</w:t>
       </w:r>
@@ -384,19 +481,19 @@
           <w:color w:val="333333"/>
           <w:sz w:val="22"/>
         </w:rPr>
-        <w:t>"Got it — and this is actually where we go a step beyond what I mentioned on the first call. On top of finding prospects in market, once they respond we handle all the back and forth, qualify them, and book the meeting straight onto your team's calendar. So your team only shows up to conversations ready to close. I'll walk you through how it works today."</w:t>
+        <w:t>"Got it — and this is actually where we go a step beyond what I mentioned on the first call. On top of finding prospects in market, once they respond we handle all the back and forth, qualify them, and book the meeting straight onto your team's calendar. So your team only shows up to conversations ready to close. Our founder will walk you through how it works on the call."</w:t>
       </w:r>
     </w:p>
     <w:p>
       <w:pPr>
-        <w:pStyle w:val="Heading1"/>
-        <w:spacing w:before="360" w:after="160"/>
+        <w:pStyle w:val="Heading2"/>
+        <w:spacing w:before="280" w:after="120"/>
       </w:pPr>
       <w:r>
         <w:rPr>
           <w:color w:val="111111"/>
         </w:rPr>
-        <w:t>The Rules</w:t>
+        <w:t>Question 3 — Budget Qualification</w:t>
       </w:r>
     </w:p>
     <w:p>
@@ -407,13 +504,268 @@
         <w:rPr>
           <w:sz w:val="22"/>
         </w:rPr>
-        <w:t>Match the bridge to what they actually said. Build only after Q2, never Q1. Sell, don't tell — make them say the pain. Never leave a pain statement hanging without a bridge.</w:t>
+        <w:t>Ask them directly:</w:t>
+      </w:r>
+    </w:p>
+    <w:p>
+      <w:pPr>
+        <w:spacing w:after="280" w:line="312" w:lineRule="auto"/>
+        <w:ind w:left="504" w:right="288"/>
+      </w:pPr>
+      <w:r>
+        <w:rPr>
+          <w:i/>
+          <w:color w:val="333333"/>
+          <w:sz w:val="22"/>
+        </w:rPr>
+        <w:t>"Our programs typically start at around [price range]. Assuming the ROI is there and everything looks good on the demo, is that budget-friendly for your team right now or in the near term?"</w:t>
+      </w:r>
+    </w:p>
+    <w:p>
+      <w:pPr>
+        <w:spacing w:after="240" w:line="312" w:lineRule="auto"/>
+      </w:pPr>
+      <w:r>
+        <w:rPr>
+          <w:sz w:val="22"/>
+        </w:rPr>
+        <w:t>When they respond — whether it's a hard yes or a hesitant maybe — acknowledge it honestly: "Makes total sense, you need to see the numbers make sense first." Then confirm what you heard: "So as long as the math works, the budget is there?" And tie it back to the call to build final interest:</w:t>
+      </w:r>
+    </w:p>
+    <w:p>
+      <w:pPr>
+        <w:spacing w:after="280" w:line="312" w:lineRule="auto"/>
+        <w:ind w:left="504" w:right="288"/>
+      </w:pPr>
+      <w:r>
+        <w:rPr>
+          <w:i/>
+          <w:color w:val="333333"/>
+          <w:sz w:val="22"/>
+        </w:rPr>
+        <w:t>"Great. On the call, our founder will break down the exact ROI you can expect, the meetings booked, and the full math behind it so you can see exactly how it pays for itself."</w:t>
+      </w:r>
+    </w:p>
+    <w:p>
+      <w:pPr>
+        <w:spacing w:after="240" w:line="312" w:lineRule="auto"/>
+      </w:pPr>
+      <w:r>
+        <w:rPr>
+          <w:sz w:val="22"/>
+        </w:rPr>
+        <w:t>Done right, these three questions aren't just checkboxes — they warm the prospect up, make them feel heard, and give them a concrete, exciting reason to show up.</w:t>
       </w:r>
     </w:p>
     <w:p>
       <w:pPr>
         <w:pStyle w:val="Heading1"/>
-        <w:spacing w:before="360" w:after="160"/>
+        <w:spacing w:before="400" w:after="160"/>
+      </w:pPr>
+      <w:r>
+        <w:rPr>
+          <w:color w:val="111111"/>
+        </w:rPr>
+        <w:t>Phase 6.3 — If They Disqualify Themselves</w:t>
+      </w:r>
+    </w:p>
+    <w:p>
+      <w:pPr>
+        <w:spacing w:after="240" w:line="312" w:lineRule="auto"/>
+      </w:pPr>
+      <w:r>
+        <w:rPr>
+          <w:sz w:val="22"/>
+        </w:rPr>
+        <w:t>If the prospect reveals during qualification that they're genuinely not a fit — wrong industry, no budget at any level, no decision-making authority — you have two options.</w:t>
+      </w:r>
+    </w:p>
+    <w:p>
+      <w:pPr>
+        <w:spacing w:after="240" w:line="312" w:lineRule="auto"/>
+      </w:pPr>
+      <w:r>
+        <w:rPr>
+          <w:b/>
+          <w:i w:val="0"/>
+          <w:sz w:val="22"/>
+        </w:rPr>
+        <w:t xml:space="preserve">Option A: offer free value anyway. </w:t>
+      </w:r>
+      <w:r>
+        <w:rPr>
+          <w:b w:val="0"/>
+          <w:i w:val="0"/>
+          <w:sz w:val="22"/>
+        </w:rPr>
+        <w:t>"I totally understand. Can I give you a resource though? We post free content on our YouTube and newsletter. Even if we're not a fit right now, your team might find it useful." This keeps the relationship warm and demonstrates generosity.</w:t>
+      </w:r>
+    </w:p>
+    <w:p>
+      <w:pPr>
+        <w:spacing w:after="240" w:line="312" w:lineRule="auto"/>
+      </w:pPr>
+      <w:r>
+        <w:rPr>
+          <w:b/>
+          <w:i w:val="0"/>
+          <w:sz w:val="22"/>
+        </w:rPr>
+        <w:t xml:space="preserve">Option B: ask for a referral. </w:t>
+      </w:r>
+      <w:r>
+        <w:rPr>
+          <w:b w:val="0"/>
+          <w:i w:val="0"/>
+          <w:sz w:val="22"/>
+        </w:rPr>
+        <w:t>"Totally fair. Is there anyone else on your team or in your network who might be a better fit for this?" Multiple times, prospects who weren't the right contact have voluntarily given the name, email, and phone number of the correct person.</w:t>
+      </w:r>
+    </w:p>
+    <w:p>
+      <w:pPr>
+        <w:pStyle w:val="Heading1"/>
+        <w:spacing w:before="400" w:after="160"/>
+      </w:pPr>
+      <w:r>
+        <w:rPr>
+          <w:color w:val="111111"/>
+        </w:rPr>
+        <w:t>Phase 7 — Scheduling Mastery</w:t>
+      </w:r>
+    </w:p>
+    <w:p>
+      <w:pPr>
+        <w:spacing w:after="240" w:line="312" w:lineRule="auto"/>
+      </w:pPr>
+      <w:r>
+        <w:rPr>
+          <w:sz w:val="22"/>
+        </w:rPr>
+        <w:t>Booking the meeting isn't just about getting a "yes." It's about getting the calendar invite sent, confirmed, and protected from no-shows.</w:t>
+      </w:r>
+    </w:p>
+    <w:p>
+      <w:pPr>
+        <w:pStyle w:val="Heading2"/>
+        <w:spacing w:before="280" w:after="120"/>
+      </w:pPr>
+      <w:r>
+        <w:rPr>
+          <w:color w:val="111111"/>
+        </w:rPr>
+        <w:t>7.1 Extreme Scheduling Flexibility</w:t>
+      </w:r>
+    </w:p>
+    <w:p>
+      <w:pPr>
+        <w:spacing w:after="240" w:line="312" w:lineRule="auto"/>
+      </w:pPr>
+      <w:r>
+        <w:rPr>
+          <w:sz w:val="22"/>
+        </w:rPr>
+        <w:t>When the prospect agrees to a meeting but pushes back on timing, cycle through options without frustration. Don't offer one time and give up. Offer three, four, five options across different days and times until you find one that works.</w:t>
+      </w:r>
+    </w:p>
+    <w:p>
+      <w:pPr>
+        <w:pStyle w:val="Heading2"/>
+        <w:spacing w:before="280" w:after="120"/>
+      </w:pPr>
+      <w:r>
+        <w:rPr>
+          <w:color w:val="111111"/>
+        </w:rPr>
+        <w:t>7.2 Get the Email and Send the Invite Live</w:t>
+      </w:r>
+    </w:p>
+    <w:p>
+      <w:pPr>
+        <w:spacing w:after="240" w:line="312" w:lineRule="auto"/>
+      </w:pPr>
+      <w:r>
+        <w:rPr>
+          <w:sz w:val="22"/>
+        </w:rPr>
+        <w:t>Always ask for their email and send the calendar invite while they're still on the phone. Don't say "I'll send it later." Send it now.</w:t>
+      </w:r>
+    </w:p>
+    <w:p>
+      <w:pPr>
+        <w:spacing w:after="280" w:line="312" w:lineRule="auto"/>
+        <w:ind w:left="504" w:right="288"/>
+      </w:pPr>
+      <w:r>
+        <w:rPr>
+          <w:i/>
+          <w:color w:val="333333"/>
+          <w:sz w:val="22"/>
+        </w:rPr>
+        <w:t>"What's your email? ... Perfect, I'm sending the invite right now. Can you just make sure it hits your inbox so it doesn't land in spam?"</w:t>
+      </w:r>
+    </w:p>
+    <w:p>
+      <w:pPr>
+        <w:spacing w:after="240" w:line="312" w:lineRule="auto"/>
+      </w:pPr>
+      <w:r>
+        <w:rPr>
+          <w:sz w:val="22"/>
+        </w:rPr>
+        <w:t>This does three things at once: it confirms the meeting is real, it gets them to open their calendar, and it creates psychological commitment.</w:t>
+      </w:r>
+    </w:p>
+    <w:p>
+      <w:pPr>
+        <w:pStyle w:val="Heading2"/>
+        <w:spacing w:before="280" w:after="120"/>
+      </w:pPr>
+      <w:r>
+        <w:rPr>
+          <w:color w:val="111111"/>
+        </w:rPr>
+        <w:t>7.3 Timezone Awareness</w:t>
+      </w:r>
+    </w:p>
+    <w:p>
+      <w:pPr>
+        <w:spacing w:after="240" w:line="312" w:lineRule="auto"/>
+      </w:pPr>
+      <w:r>
+        <w:rPr>
+          <w:sz w:val="22"/>
+        </w:rPr>
+        <w:t>Always confirm the prospect's timezone. A missed timezone conversion is a missed meeting.</w:t>
+      </w:r>
+    </w:p>
+    <w:p>
+      <w:pPr>
+        <w:pStyle w:val="Heading1"/>
+        <w:spacing w:before="400" w:after="160"/>
+      </w:pPr>
+      <w:r>
+        <w:rPr>
+          <w:color w:val="111111"/>
+        </w:rPr>
+        <w:t>The Rules (quick reference)</w:t>
+      </w:r>
+    </w:p>
+    <w:p>
+      <w:pPr>
+        <w:spacing w:after="240" w:line="312" w:lineRule="auto"/>
+      </w:pPr>
+      <w:r>
+        <w:rPr>
+          <w:sz w:val="22"/>
+        </w:rPr>
+        <w:t>Secure the call first, qualify second. Match the bridge to what they actually said. Build only after Q2, never Q1. Sell, don't tell — make them say the pain. Never leave a pain statement hanging without a bridge. Always send the calendar invite live, never later.</w:t>
+      </w:r>
+    </w:p>
+    <w:p>
+      <w:pPr>
+        <w:pStyle w:val="Heading1"/>
+        <w:spacing w:before="400" w:after="160"/>
       </w:pPr>
       <w:r>
         <w:rPr>

</xml_diff>